<commit_message>
Add primitive visual property
</commit_message>
<xml_diff>
--- a/StructureHelper/Documentation/Manuals/Руководство пользователя.docx
+++ b/StructureHelper/Documentation/Manuals/Руководство пользователя.docx
@@ -5532,7 +5532,15 @@
     </w:p>
     <w:p>
       <w:r>
-        <w:t>Данная лицензия разрешает лицам, получившим копию данного программного обеспечения и сопутствующей документации (далее — Программное обеспечение), безвозмездно использовать Программное обеспечение без ограничений, включая неограниченное право на использование, копирование, изменение, слияние, публикацию, распространение, сублицензирование и/или продажу копий Программного обеспечения, а также лицам, которым предоставляется данное Программное обеспечение, при соблюдении следующих условий:</w:t>
+        <w:t xml:space="preserve">Данная лицензия разрешает лицам, получившим копию данного программного обеспечения и сопутствующей документации (далее — Программное обеспечение), безвозмездно использовать Программное обеспечение без ограничений, включая неограниченное право на использование, копирование, изменение, слияние, публикацию, распространение, </w:t>
+      </w:r>
+      <w:proofErr w:type="spellStart"/>
+      <w:r>
+        <w:t>сублицензирование</w:t>
+      </w:r>
+      <w:proofErr w:type="spellEnd"/>
+      <w:r>
+        <w:t xml:space="preserve"> и/или продажу копий Программного обеспечения, а также лицам, которым предоставляется данное Программное обеспечение, при соблюдении следующих условий:</w:t>
       </w:r>
     </w:p>
     <w:p>
@@ -5817,7 +5825,15 @@
     </w:p>
     <w:p>
       <w:r>
-        <w:t>А также в группе в социальной сети «Вконтакте»</w:t>
+        <w:t>А также в группе в социальной сети «</w:t>
+      </w:r>
+      <w:proofErr w:type="spellStart"/>
+      <w:r>
+        <w:t>Вконтакте</w:t>
+      </w:r>
+      <w:proofErr w:type="spellEnd"/>
+      <w:r>
+        <w:t>»</w:t>
       </w:r>
     </w:p>
     <w:p>
@@ -5963,7 +5979,15 @@
     </w:p>
     <w:p>
       <w:r>
-        <w:t>- Запуск расчета. При запуске расчета происходит открытие модуля, связанного с данным типом расчета и производится редактирование параметров расчета непосредственно в данном модуле.</w:t>
+        <w:t xml:space="preserve">- Запуск расчета. При запуске расчета происходит открытие модуля, связанного с данным типом </w:t>
+      </w:r>
+      <w:proofErr w:type="gramStart"/>
+      <w:r>
+        <w:t>расчета</w:t>
+      </w:r>
+      <w:proofErr w:type="gramEnd"/>
+      <w:r>
+        <w:t xml:space="preserve"> и производится редактирование параметров расчета непосредственно в данном модуле.</w:t>
       </w:r>
     </w:p>
     <w:p>
@@ -6205,12 +6229,14 @@
                 <w:lang w:val="en-US"/>
               </w:rPr>
             </w:pPr>
+            <w:proofErr w:type="spellStart"/>
             <w:r>
               <w:rPr>
                 <w:lang w:val="en-US"/>
               </w:rPr>
               <w:t>Nz</w:t>
             </w:r>
+            <w:proofErr w:type="spellEnd"/>
           </w:p>
         </w:tc>
         <w:tc>
@@ -6225,12 +6251,14 @@
                 <w:lang w:val="en-US"/>
               </w:rPr>
             </w:pPr>
+            <w:proofErr w:type="spellStart"/>
             <w:r>
               <w:rPr>
                 <w:lang w:val="en-US"/>
               </w:rPr>
               <w:t>Kx</w:t>
             </w:r>
+            <w:proofErr w:type="spellEnd"/>
           </w:p>
         </w:tc>
         <w:tc>
@@ -6265,12 +6293,14 @@
                 <w:lang w:val="en-US"/>
               </w:rPr>
             </w:pPr>
+            <w:proofErr w:type="spellStart"/>
             <w:r>
               <w:rPr>
                 <w:lang w:val="en-US"/>
               </w:rPr>
               <w:t>EpsZ</w:t>
             </w:r>
+            <w:proofErr w:type="spellEnd"/>
           </w:p>
         </w:tc>
       </w:tr>
@@ -6803,12 +6833,14 @@
       <w:r>
         <w:t xml:space="preserve"> столбец </w:t>
       </w:r>
+      <w:proofErr w:type="spellStart"/>
       <w:r>
         <w:rPr>
           <w:lang w:val="en-US"/>
         </w:rPr>
         <w:t>EpsZ</w:t>
       </w:r>
+      <w:proofErr w:type="spellEnd"/>
       <w:r>
         <w:t xml:space="preserve">, а для оси </w:t>
       </w:r>
@@ -6871,7 +6903,15 @@
     </w:p>
     <w:p>
       <w:r>
-        <w:t>По каждому изополю назна</w:t>
+        <w:t xml:space="preserve">По каждому </w:t>
+      </w:r>
+      <w:proofErr w:type="spellStart"/>
+      <w:r>
+        <w:t>изополю</w:t>
+      </w:r>
+      <w:proofErr w:type="spellEnd"/>
+      <w:r>
+        <w:t xml:space="preserve"> назна</w:t>
       </w:r>
       <w:r>
         <w:t>чается разбивка на цветовые диапазоны, соответствующие числовым значениям. Цветовые диапазоны поддерживают отключение отображения – в этом случае соответствующий диапазон закрашивается серым цветом.</w:t>
@@ -6879,7 +6919,23 @@
     </w:p>
     <w:p>
       <w:r>
-        <w:t>По умолчанию цветовые диапазоны разбиваются от минимального до максимального значения по изополю, вы можете самостоятельно указать минимальное и максимальное значение для определения цветовых диапазонов. В этом случае значения, выходящие за границы диапазонов (если таковые имеются) будут выведены серым цветом. Данный подход удобно использовать, например, для обозначения растянутой зоны железобетонных элементов в которых образуется трещина.</w:t>
+        <w:t xml:space="preserve">По умолчанию цветовые диапазоны разбиваются от минимального до максимального значения по </w:t>
+      </w:r>
+      <w:proofErr w:type="spellStart"/>
+      <w:r>
+        <w:t>изополю</w:t>
+      </w:r>
+      <w:proofErr w:type="spellEnd"/>
+      <w:r>
+        <w:t xml:space="preserve">, вы можете самостоятельно указать минимальное и максимальное значение для определения цветовых диапазонов. В этом случае значения, выходящие за границы диапазонов (если таковые имеются) будут выведены серым цветом. Данный подход удобно использовать, например, для обозначения </w:t>
+      </w:r>
+      <w:proofErr w:type="gramStart"/>
+      <w:r>
+        <w:t>растянутой зоны железобетонных элементов</w:t>
+      </w:r>
+      <w:proofErr w:type="gramEnd"/>
+      <w:r>
+        <w:t xml:space="preserve"> в которых образуется трещина.</w:t>
       </w:r>
     </w:p>
     <w:p>
@@ -6893,7 +6949,15 @@
         <w:t>StructureHelper</w:t>
       </w:r>
       <w:r>
-        <w:t xml:space="preserve"> приняты по аналогии с наиболее распространенными программными комплексами – Лира, ИНЖ.ру, СКАД и т.п.</w:t>
+        <w:t xml:space="preserve"> приняты по аналогии с наиболее распространенными программными комплексами – Лира, </w:t>
+      </w:r>
+      <w:proofErr w:type="spellStart"/>
+      <w:r>
+        <w:t>ИНЖ.ру</w:t>
+      </w:r>
+      <w:proofErr w:type="spellEnd"/>
+      <w:r>
+        <w:t>, СКАД и т.п.</w:t>
       </w:r>
     </w:p>
     <w:p>
@@ -6918,12 +6982,28 @@
     </w:p>
     <w:p>
       <w:r>
-        <w:t>- сумма значений по изополю.</w:t>
-      </w:r>
-    </w:p>
-    <w:p>
-      <w:r>
-        <w:t xml:space="preserve">Также вы можете построить линию отсечения и определить сумму значений выше и ниже линии отсечения. Линия отсечения задается «в отрезках», т.е. задаются отрезки отсекаемые линией на осях </w:t>
+        <w:t xml:space="preserve">- сумма значений по </w:t>
+      </w:r>
+      <w:proofErr w:type="spellStart"/>
+      <w:r>
+        <w:t>изополю</w:t>
+      </w:r>
+      <w:proofErr w:type="spellEnd"/>
+      <w:r>
+        <w:t>.</w:t>
+      </w:r>
+    </w:p>
+    <w:p>
+      <w:r>
+        <w:t xml:space="preserve">Также вы можете построить линию отсечения и определить сумму значений выше и ниже линии отсечения. Линия отсечения задается «в отрезках», т.е. задаются </w:t>
+      </w:r>
+      <w:proofErr w:type="gramStart"/>
+      <w:r>
+        <w:t>отрезки</w:t>
+      </w:r>
+      <w:proofErr w:type="gramEnd"/>
+      <w:r>
+        <w:t xml:space="preserve"> отсекаемые линией на осях </w:t>
       </w:r>
       <w:r>
         <w:rPr>
@@ -8542,7 +8622,15 @@
     </w:p>
     <w:p>
       <w:r>
-        <w:t>Поскольку для сечения, имеющего различную жесткость элементарных участков определение суммарной площади не имеет смысла, вместо нее определяется суммарная продольная жесткость:</w:t>
+        <w:t xml:space="preserve">Поскольку для сечения, имеющего различную жесткость элементарных участков </w:t>
+      </w:r>
+      <w:proofErr w:type="gramStart"/>
+      <w:r>
+        <w:t>определение суммарной площади</w:t>
+      </w:r>
+      <w:proofErr w:type="gramEnd"/>
+      <w:r>
+        <w:t xml:space="preserve"> не имеет смысла, вместо нее определяется суммарная продольная жесткость:</w:t>
       </w:r>
     </w:p>
     <w:p>
@@ -10480,7 +10568,15 @@
         <w:t>,</w:t>
       </w:r>
       <w:r>
-        <w:t xml:space="preserve"> имеют также и наибольшее удлинение относительного окружающего бетона. Например, арматурный стержень, имеющий наибольшее относительное удлинение может находиться в отремонтированном (восстановленном) слое бетона и иметь меньшую ширину раскрытия трещины относительно других стержней (или не иметь трещины совсем).</w:t>
+        <w:t xml:space="preserve"> имеют также и наибольшее удлинение относительного окружающего бетона. Например, арматурный стержень, имеющий </w:t>
+      </w:r>
+      <w:proofErr w:type="gramStart"/>
+      <w:r>
+        <w:t>наибольшее относительное удлинение</w:t>
+      </w:r>
+      <w:proofErr w:type="gramEnd"/>
+      <w:r>
+        <w:t xml:space="preserve"> может находиться в отремонтированном (восстановленном) слое бетона и иметь меньшую ширину раскрытия трещины относительно других стержней (или не иметь трещины совсем).</w:t>
       </w:r>
     </w:p>
     <w:p>
@@ -10552,8 +10648,13 @@
       <w:bookmarkEnd w:id="16"/>
     </w:p>
     <w:p>
-      <w:r>
-        <w:t>В соответствии с требования СП 63.13330.2018 расчет на образование трещин выполняется для длительно или кратковременно действующих нагрузок, при этом диаграмма растянутого и сжатого бетона всегда принимается как для кратковременного действия нагрузки.</w:t>
+      <w:proofErr w:type="gramStart"/>
+      <w:r>
+        <w:t>В соответствии с требования</w:t>
+      </w:r>
+      <w:proofErr w:type="gramEnd"/>
+      <w:r>
+        <w:t xml:space="preserve"> СП 63.13330.2018 расчет на образование трещин выполняется для длительно или кратковременно действующих нагрузок, при этом диаграмма растянутого и сжатого бетона всегда принимается как для кратковременного действия нагрузки.</w:t>
       </w:r>
     </w:p>
     <w:p>
@@ -10673,12 +10774,15 @@
       <w:r>
         <w:t xml:space="preserve">, </w:t>
       </w:r>
+      <w:proofErr w:type="spellStart"/>
+      <w:proofErr w:type="gramStart"/>
       <w:r>
         <w:rPr>
           <w:lang w:val="en-US"/>
         </w:rPr>
         <w:t>Nz</w:t>
       </w:r>
+      <w:proofErr w:type="spellEnd"/>
       <w:r>
         <w:t>,</w:t>
       </w:r>
@@ -10688,6 +10792,7 @@
         </w:rPr>
         <w:t>a</w:t>
       </w:r>
+      <w:proofErr w:type="gramEnd"/>
       <w:r>
         <w:t>)</w:t>
       </w:r>
@@ -10742,12 +10847,14 @@
       <w:r>
         <w:t xml:space="preserve"> = 0, </w:t>
       </w:r>
+      <w:proofErr w:type="spellStart"/>
       <w:r>
         <w:rPr>
           <w:lang w:val="en-US"/>
         </w:rPr>
         <w:t>Nz</w:t>
       </w:r>
+      <w:proofErr w:type="spellEnd"/>
       <w:r>
         <w:t xml:space="preserve"> = 0</w:t>
       </w:r>
@@ -10834,7 +10941,15 @@
         <w:t>StructureHelper</w:t>
       </w:r>
       <w:r>
-        <w:t xml:space="preserve"> предварительное напряжение задается в явном виде как предварительная деформация, то усилие предварительного напряжения не нужно учитывать как внешнюю силу при расчете трещиностойкости сечения, как это принято в методе ядровых моментов.</w:t>
+        <w:t xml:space="preserve"> предварительное напряжение задается в явном виде как предварительная деформация, то усилие предварительного напряжения не нужно </w:t>
+      </w:r>
+      <w:proofErr w:type="gramStart"/>
+      <w:r>
+        <w:t>учитывать</w:t>
+      </w:r>
+      <w:proofErr w:type="gramEnd"/>
+      <w:r>
+        <w:t xml:space="preserve"> как внешнюю силу при расчете трещиностойкости сечения, как это принято в методе ядровых моментов.</w:t>
       </w:r>
     </w:p>
     <w:p>
@@ -11677,7 +11792,21 @@
         <w:rPr>
           <w:rFonts w:eastAsiaTheme="minorEastAsia"/>
         </w:rPr>
-        <w:t xml:space="preserve"> – начальное относительное удлинение бетона, вызванное его предварительным напряжением, например, от действия усадки или при более поздней укладке бетона в момент, когда сечение уже имеет некоторое напряженное состояние.</w:t>
+        <w:t xml:space="preserve"> – начальное относительное удлинение бетона, вызванное его предварительным напряжением, например, от дейс</w:t>
+      </w:r>
+      <w:proofErr w:type="spellStart"/>
+      <w:r>
+        <w:rPr>
+          <w:rFonts w:eastAsiaTheme="minorEastAsia"/>
+        </w:rPr>
+        <w:t>твия</w:t>
+      </w:r>
+      <w:proofErr w:type="spellEnd"/>
+      <w:r>
+        <w:rPr>
+          <w:rFonts w:eastAsiaTheme="minorEastAsia"/>
+        </w:rPr>
+        <w:t xml:space="preserve"> усадки или при более поздней укладке бетона в момент, когда сечение уже имеет некоторое напряженное состояние.</w:t>
       </w:r>
       <w:r>
         <w:rPr>
@@ -12227,7 +12356,21 @@
         <w:rPr>
           <w:rFonts w:eastAsiaTheme="minorEastAsia"/>
         </w:rPr>
-        <w:t xml:space="preserve"> участвует величина предварительного напряжения, то значение коэффициента </w:t>
+        <w:t xml:space="preserve"> участвует вел</w:t>
+      </w:r>
+      <w:proofErr w:type="spellStart"/>
+      <w:r>
+        <w:rPr>
+          <w:rFonts w:eastAsiaTheme="minorEastAsia"/>
+        </w:rPr>
+        <w:t>ичина</w:t>
+      </w:r>
+      <w:proofErr w:type="spellEnd"/>
+      <w:r>
+        <w:rPr>
+          <w:rFonts w:eastAsiaTheme="minorEastAsia"/>
+        </w:rPr>
+        <w:t xml:space="preserve"> предварительного напряжения, то значение коэффициента </w:t>
       </w:r>
       <m:oMath>
         <m:sSub>
@@ -12263,11 +12406,19 @@
         </w:rPr>
         <w:t xml:space="preserve"> для данных ар</w:t>
       </w:r>
+      <w:proofErr w:type="spellStart"/>
       <w:r>
         <w:rPr>
           <w:rFonts w:eastAsiaTheme="minorEastAsia"/>
         </w:rPr>
-        <w:t>матурных стержней будет разным.</w:t>
+        <w:t>матурных</w:t>
+      </w:r>
+      <w:proofErr w:type="spellEnd"/>
+      <w:r>
+        <w:rPr>
+          <w:rFonts w:eastAsiaTheme="minorEastAsia"/>
+        </w:rPr>
+        <w:t xml:space="preserve"> стержней будет разным.</w:t>
       </w:r>
     </w:p>
     <w:p>
@@ -13104,11 +13255,19 @@
         </w:rPr>
         <w:t xml:space="preserve"> для железобетонной балки, имеющей 3 стержня в растянутой (нижней) зоне, при этом для стержня в середине балки задано предваритель</w:t>
       </w:r>
+      <w:proofErr w:type="spellStart"/>
       <w:r>
         <w:rPr>
           <w:rFonts w:eastAsiaTheme="minorEastAsia"/>
         </w:rPr>
-        <w:t>ная деформация равная 0.001, для остальных стержней предварительное напряжение не предусмотрено.</w:t>
+        <w:t>ная</w:t>
+      </w:r>
+      <w:proofErr w:type="spellEnd"/>
+      <w:r>
+        <w:rPr>
+          <w:rFonts w:eastAsiaTheme="minorEastAsia"/>
+        </w:rPr>
+        <w:t xml:space="preserve"> деформация равная 0.001, для остальных стержней предварительное напряжение не предусмотрено.</w:t>
       </w:r>
     </w:p>
     <w:p>
@@ -13315,9 +13474,22 @@
       </w:r>
     </w:p>
     <w:p>
+      <w:proofErr w:type="gramStart"/>
       <w:r>
         <w:lastRenderedPageBreak/>
-        <w:t>Также как и для коэффициента, учитывающего работу растянутого бетона между трещинами пользователь может назначить постоянное значение базового расстояния между трещинами. С учетом того, что максимальное значение расстояниям между трещинами в соответствии с СП 63.13330.2018 составляет 400мм, значение принятое по умолчанию также равняется 400мм.</w:t>
+        <w:t>Также</w:t>
+      </w:r>
+      <w:proofErr w:type="gramEnd"/>
+      <w:r>
+        <w:t xml:space="preserve"> как и для коэффициента, учитывающего работу растянутого бетона между трещинами пользователь может назначить постоянное значение базового расстояния между трещинами. С учетом того, что максимальное значение расстояниям между трещинами в соответствии с СП 63.13330.2018 составляет 400мм, </w:t>
+      </w:r>
+      <w:proofErr w:type="gramStart"/>
+      <w:r>
+        <w:t>значение</w:t>
+      </w:r>
+      <w:proofErr w:type="gramEnd"/>
+      <w:r>
+        <w:t xml:space="preserve"> принятое по умолчанию также равняется 400мм.</w:t>
       </w:r>
     </w:p>
     <w:p>
@@ -14249,6 +14421,7 @@
         </w:rPr>
         <w:t xml:space="preserve"> – приведенная площадь </w:t>
       </w:r>
+      <w:proofErr w:type="spellStart"/>
       <w:r>
         <w:rPr>
           <w:rFonts w:eastAsiaTheme="minorEastAsia"/>
@@ -14256,6 +14429,7 @@
         </w:rPr>
         <w:t>i</w:t>
       </w:r>
+      <w:proofErr w:type="spellEnd"/>
       <w:r>
         <w:rPr>
           <w:rFonts w:eastAsiaTheme="minorEastAsia"/>
@@ -14444,6 +14618,7 @@
         </w:rPr>
         <w:t xml:space="preserve"> – относительная деформация </w:t>
       </w:r>
+      <w:proofErr w:type="spellStart"/>
       <w:r>
         <w:rPr>
           <w:rFonts w:eastAsiaTheme="minorEastAsia"/>
@@ -14451,6 +14626,7 @@
         </w:rPr>
         <w:t>i</w:t>
       </w:r>
+      <w:proofErr w:type="spellEnd"/>
       <w:r>
         <w:rPr>
           <w:rFonts w:eastAsiaTheme="minorEastAsia"/>
@@ -15123,7 +15299,15 @@
         </m:sSub>
       </m:oMath>
       <w:r>
-        <w:t xml:space="preserve"> - ширина раскрытия трещин от непродолжительного действия </w:t>
+        <w:t xml:space="preserve"> - ши</w:t>
+      </w:r>
+      <w:proofErr w:type="spellStart"/>
+      <w:r>
+        <w:t>рина</w:t>
+      </w:r>
+      <w:proofErr w:type="spellEnd"/>
+      <w:r>
+        <w:t xml:space="preserve"> раскрытия трещин от непродолжительного действия </w:t>
       </w:r>
       <w:r>
         <w:t>постоянных и</w:t>
@@ -15946,7 +16130,15 @@
         <w:t xml:space="preserve">, </w:t>
       </w:r>
       <w:r>
-        <w:t xml:space="preserve">когда в рассматриваемом диапазоне материал работает линейно упруго вы можете высчитать начальную </w:t>
+        <w:t xml:space="preserve">когда в рассматриваемом диапазоне материал работает линейно </w:t>
+      </w:r>
+      <w:proofErr w:type="gramStart"/>
+      <w:r>
+        <w:t>упруго</w:t>
+      </w:r>
+      <w:proofErr w:type="gramEnd"/>
+      <w:r>
+        <w:t xml:space="preserve"> вы можете высчитать начальную </w:t>
       </w:r>
       <w:r>
         <w:rPr>
@@ -16201,12 +16393,14 @@
       <w:r>
         <w:t xml:space="preserve"> (</w:t>
       </w:r>
+      <w:proofErr w:type="spellStart"/>
       <w:r>
         <w:rPr>
           <w:lang w:val="en-US"/>
         </w:rPr>
         <w:t>Kx</w:t>
       </w:r>
+      <w:proofErr w:type="spellEnd"/>
       <w:r>
         <w:t>),</w:t>
       </w:r>
@@ -17861,7 +18055,15 @@
       </w:r>
       <w:r>
         <w:lastRenderedPageBreak/>
-        <w:t>ограничивает ваши возможности по ручному созданию примитивов, материалов и т.п.. Также вы можете использовать несколько шаблонов последовательно для созданий нужного вам поперечного сечения.</w:t>
+        <w:t xml:space="preserve">ограничивает ваши возможности по ручному созданию примитивов, материалов и </w:t>
+      </w:r>
+      <w:proofErr w:type="gramStart"/>
+      <w:r>
+        <w:t>т.п..</w:t>
+      </w:r>
+      <w:proofErr w:type="gramEnd"/>
+      <w:r>
+        <w:t xml:space="preserve"> Также вы можете использовать несколько шаблонов последовательно для созданий нужного вам поперечного сечения.</w:t>
       </w:r>
     </w:p>
     <w:p>
@@ -18119,7 +18321,15 @@
         <w:t xml:space="preserve"> </w:t>
       </w:r>
       <w:r>
-        <w:t>не предусмотрено возможности задавать точки значений в произвольных точках геометрических примитивов, однако вы можете собрать сечение из примитивов таким образом, что бы получить нужные вам точки значений.</w:t>
+        <w:t xml:space="preserve">не предусмотрено возможности задавать точки значений в произвольных точках геометрических примитивов, однако вы можете собрать сечение из примитивов </w:t>
+      </w:r>
+      <w:proofErr w:type="gramStart"/>
+      <w:r>
+        <w:t>таким образом, что бы</w:t>
+      </w:r>
+      <w:proofErr w:type="gramEnd"/>
+      <w:r>
+        <w:t xml:space="preserve"> получить нужные вам точки значений.</w:t>
       </w:r>
     </w:p>
     <w:p>
@@ -18876,12 +19086,14 @@
       <w:r>
         <w:t xml:space="preserve">, </w:t>
       </w:r>
+      <w:proofErr w:type="spellStart"/>
       <w:r>
         <w:rPr>
           <w:lang w:val="en-US"/>
         </w:rPr>
         <w:t>Nz</w:t>
       </w:r>
+      <w:proofErr w:type="spellEnd"/>
       <w:r>
         <w:t xml:space="preserve"> </w:t>
       </w:r>
@@ -20521,7 +20733,15 @@
     </w:p>
     <w:p>
       <w:r>
-        <w:t>- С двухлинейной диаграммой «напряжения-деформации» (с идеальной упруго-пластической работой),</w:t>
+        <w:t xml:space="preserve">- С двухлинейной диаграммой «напряжения-деформации» (с идеальной </w:t>
+      </w:r>
+      <w:proofErr w:type="gramStart"/>
+      <w:r>
+        <w:t>упруго-пластической</w:t>
+      </w:r>
+      <w:proofErr w:type="gramEnd"/>
+      <w:r>
+        <w:t xml:space="preserve"> работой),</w:t>
       </w:r>
     </w:p>
     <w:p>
@@ -20904,8 +21124,8 @@
       <w:pPr>
         <w:pStyle w:val="ae"/>
       </w:pPr>
-      <w:bookmarkStart w:id="54" w:name="_Hlk172303975"/>
-      <w:bookmarkStart w:id="55" w:name="_Toc203333398"/>
+      <w:bookmarkStart w:id="54" w:name="_Toc203333398"/>
+      <w:bookmarkStart w:id="55" w:name="_Hlk172303975"/>
       <w:r>
         <w:t xml:space="preserve">Рисунок </w:t>
       </w:r>
@@ -20981,10 +21201,10 @@
       <w:r>
         <w:t>.</w:t>
       </w:r>
-      <w:bookmarkEnd w:id="55"/>
+      <w:bookmarkEnd w:id="54"/>
     </w:p>
     <w:bookmarkEnd w:id="53"/>
-    <w:bookmarkEnd w:id="54"/>
+    <w:bookmarkEnd w:id="55"/>
     <w:p>
       <w:pPr>
         <w:rPr>
@@ -21080,50 +21300,49 @@
       <w:r>
         <w:rPr>
           <w:noProof/>
+        </w:rPr>
+        <w:t>11</w:t>
+      </w:r>
+      <w:r>
+        <w:fldChar w:fldCharType="end"/>
+      </w:r>
+      <w:r>
+        <w:noBreakHyphen/>
+      </w:r>
+      <w:r>
+        <w:fldChar w:fldCharType="begin"/>
+      </w:r>
+      <w:r>
+        <w:instrText xml:space="preserve"> </w:instrText>
+      </w:r>
+      <w:r>
+        <w:rPr>
           <w:lang w:val="en-US"/>
         </w:rPr>
-        <w:t>11</w:t>
-      </w:r>
-      <w:r>
-        <w:fldChar w:fldCharType="end"/>
-      </w:r>
-      <w:r>
-        <w:noBreakHyphen/>
-      </w:r>
-      <w:r>
-        <w:fldChar w:fldCharType="begin"/>
+        <w:instrText>SEQ</w:instrText>
       </w:r>
       <w:r>
         <w:instrText xml:space="preserve"> </w:instrText>
       </w:r>
       <w:r>
+        <w:instrText>Рисунок</w:instrText>
+      </w:r>
+      <w:r>
+        <w:instrText xml:space="preserve"> \* </w:instrText>
+      </w:r>
+      <w:r>
         <w:rPr>
           <w:lang w:val="en-US"/>
         </w:rPr>
-        <w:instrText>SEQ</w:instrText>
-      </w:r>
-      <w:r>
-        <w:instrText xml:space="preserve"> </w:instrText>
-      </w:r>
-      <w:r>
-        <w:instrText>Рисунок</w:instrText>
-      </w:r>
-      <w:r>
-        <w:instrText xml:space="preserve"> \* </w:instrText>
+        <w:instrText>ARABIC</w:instrText>
+      </w:r>
+      <w:r>
+        <w:instrText xml:space="preserve"> \</w:instrText>
       </w:r>
       <w:r>
         <w:rPr>
           <w:lang w:val="en-US"/>
         </w:rPr>
-        <w:instrText>ARABIC</w:instrText>
-      </w:r>
-      <w:r>
-        <w:instrText xml:space="preserve"> \</w:instrText>
-      </w:r>
-      <w:r>
-        <w:rPr>
-          <w:lang w:val="en-US"/>
-        </w:rPr>
         <w:instrText>s</w:instrText>
       </w:r>
       <w:r>
@@ -21135,7 +21354,6 @@
       <w:r>
         <w:rPr>
           <w:noProof/>
-          <w:lang w:val="en-US"/>
         </w:rPr>
         <w:t>8</w:t>
       </w:r>
@@ -22727,7 +22945,21 @@
         <w:rPr>
           <w:lang w:eastAsia="ru-RU"/>
         </w:rPr>
-        <w:t>В общем случае, старайтесь не выбирать слишком много критериев построения таких как предикаты, группы предельных состояний и длительности, так как расчет линий предельного сопротивления является достаточно ресурснозатратным и может занимать длительное время.</w:t>
+        <w:t xml:space="preserve">В общем случае, старайтесь не выбирать слишком много критериев построения таких как предикаты, группы предельных состояний и длительности, так как расчет линий предельного сопротивления является достаточно </w:t>
+      </w:r>
+      <w:proofErr w:type="spellStart"/>
+      <w:r>
+        <w:rPr>
+          <w:lang w:eastAsia="ru-RU"/>
+        </w:rPr>
+        <w:t>ресурснозатратным</w:t>
+      </w:r>
+      <w:proofErr w:type="spellEnd"/>
+      <w:r>
+        <w:rPr>
+          <w:lang w:eastAsia="ru-RU"/>
+        </w:rPr>
+        <w:t xml:space="preserve"> и может занимать длительное время.</w:t>
       </w:r>
     </w:p>
     <w:bookmarkEnd w:id="63"/>
@@ -23048,12 +23280,14 @@
       <w:r>
         <w:t>(</w:t>
       </w:r>
+      <w:proofErr w:type="spellStart"/>
       <w:r>
         <w:rPr>
           <w:lang w:val="en-US"/>
         </w:rPr>
         <w:t>PsiS</w:t>
       </w:r>
+      <w:proofErr w:type="spellEnd"/>
       <w:r>
         <w:t>). Если признак установлен, то пользователь может указать необходимое значение коэффициента самостоятельно, по умолчания принимается значение равное 1.0 (максимальное значение по СП63.13330.2018), что соответствует отсутствию осреднения деформаций</w:t>
       </w:r>
@@ -23073,12 +23307,14 @@
       <w:r>
         <w:t xml:space="preserve">Расчет трещиностойкости рекомендуется сначала выполнять с установленными указанными выше пользовательскими признаками, так как это значительно ускоряет выполняемый расчет, особенно на мелкой сетке элементарных участков. Если предъявляемые требования по трещиностойкости не выполняются, то рекомендуется отключить директивное назначение коэффициента </w:t>
       </w:r>
+      <w:proofErr w:type="spellStart"/>
       <w:r>
         <w:rPr>
           <w:lang w:val="en-US"/>
         </w:rPr>
         <w:t>PsiS</w:t>
       </w:r>
+      <w:proofErr w:type="spellEnd"/>
       <w:r>
         <w:t xml:space="preserve"> и базового расстояния между трещинами.</w:t>
       </w:r>
@@ -23832,12 +24068,14 @@
                 <w:lang w:val="en-US"/>
               </w:rPr>
             </w:pPr>
+            <w:proofErr w:type="spellStart"/>
             <w:r>
               <w:rPr>
                 <w:lang w:val="en-US"/>
               </w:rPr>
               <w:t>Kx</w:t>
             </w:r>
+            <w:proofErr w:type="spellEnd"/>
           </w:p>
         </w:tc>
         <w:tc>
@@ -24028,12 +24266,14 @@
                 <w:lang w:val="en-US"/>
               </w:rPr>
             </w:pPr>
+            <w:proofErr w:type="spellStart"/>
             <w:r>
               <w:rPr>
                 <w:lang w:val="en-US"/>
               </w:rPr>
               <w:t>Nz</w:t>
             </w:r>
+            <w:proofErr w:type="spellEnd"/>
           </w:p>
         </w:tc>
         <w:tc>
@@ -24080,12 +24320,14 @@
                 <w:lang w:val="en-US"/>
               </w:rPr>
             </w:pPr>
+            <w:proofErr w:type="spellStart"/>
             <w:r>
               <w:rPr>
                 <w:lang w:val="en-US"/>
               </w:rPr>
               <w:t>EpsilonZ</w:t>
             </w:r>
+            <w:proofErr w:type="spellEnd"/>
           </w:p>
         </w:tc>
         <w:tc>
@@ -24116,8 +24358,13 @@
               <w:ind w:firstLine="0"/>
               <w:jc w:val="center"/>
             </w:pPr>
-            <w:r>
-              <w:t>Д.ед.</w:t>
+            <w:proofErr w:type="spellStart"/>
+            <w:r>
+              <w:t>Д.ед</w:t>
+            </w:r>
+            <w:proofErr w:type="spellEnd"/>
+            <w:r>
+              <w:t>.</w:t>
             </w:r>
           </w:p>
         </w:tc>
@@ -24239,50 +24486,49 @@
       <w:r>
         <w:rPr>
           <w:noProof/>
+        </w:rPr>
+        <w:t>13</w:t>
+      </w:r>
+      <w:r>
+        <w:fldChar w:fldCharType="end"/>
+      </w:r>
+      <w:r>
+        <w:noBreakHyphen/>
+      </w:r>
+      <w:r>
+        <w:fldChar w:fldCharType="begin"/>
+      </w:r>
+      <w:r>
+        <w:instrText xml:space="preserve"> </w:instrText>
+      </w:r>
+      <w:r>
+        <w:rPr>
           <w:lang w:val="en-US"/>
         </w:rPr>
-        <w:t>13</w:t>
-      </w:r>
-      <w:r>
-        <w:fldChar w:fldCharType="end"/>
-      </w:r>
-      <w:r>
-        <w:noBreakHyphen/>
-      </w:r>
-      <w:r>
-        <w:fldChar w:fldCharType="begin"/>
+        <w:instrText>SEQ</w:instrText>
       </w:r>
       <w:r>
         <w:instrText xml:space="preserve"> </w:instrText>
       </w:r>
       <w:r>
+        <w:instrText>Рисунок</w:instrText>
+      </w:r>
+      <w:r>
+        <w:instrText xml:space="preserve"> \* </w:instrText>
+      </w:r>
+      <w:r>
         <w:rPr>
           <w:lang w:val="en-US"/>
         </w:rPr>
-        <w:instrText>SEQ</w:instrText>
-      </w:r>
-      <w:r>
-        <w:instrText xml:space="preserve"> </w:instrText>
-      </w:r>
-      <w:r>
-        <w:instrText>Рисунок</w:instrText>
-      </w:r>
-      <w:r>
-        <w:instrText xml:space="preserve"> \* </w:instrText>
+        <w:instrText>ARABIC</w:instrText>
+      </w:r>
+      <w:r>
+        <w:instrText xml:space="preserve"> \</w:instrText>
       </w:r>
       <w:r>
         <w:rPr>
           <w:lang w:val="en-US"/>
         </w:rPr>
-        <w:instrText>ARABIC</w:instrText>
-      </w:r>
-      <w:r>
-        <w:instrText xml:space="preserve"> \</w:instrText>
-      </w:r>
-      <w:r>
-        <w:rPr>
-          <w:lang w:val="en-US"/>
-        </w:rPr>
         <w:instrText>s</w:instrText>
       </w:r>
       <w:r>
@@ -24294,7 +24540,6 @@
       <w:r>
         <w:rPr>
           <w:noProof/>
-          <w:lang w:val="en-US"/>
         </w:rPr>
         <w:t>1</w:t>
       </w:r>
@@ -24415,125 +24660,129 @@
       <w:r>
         <w:rPr>
           <w:noProof/>
+        </w:rPr>
+        <w:t>13</w:t>
+      </w:r>
+      <w:r>
+        <w:fldChar w:fldCharType="end"/>
+      </w:r>
+      <w:r>
+        <w:noBreakHyphen/>
+      </w:r>
+      <w:r>
+        <w:fldChar w:fldCharType="begin"/>
+      </w:r>
+      <w:r>
+        <w:instrText xml:space="preserve"> </w:instrText>
+      </w:r>
+      <w:r>
+        <w:rPr>
           <w:lang w:val="en-US"/>
         </w:rPr>
-        <w:t>13</w:t>
-      </w:r>
-      <w:r>
+        <w:instrText>SEQ</w:instrText>
+      </w:r>
+      <w:r>
+        <w:instrText xml:space="preserve"> </w:instrText>
+      </w:r>
+      <w:r>
+        <w:instrText>Рисунок</w:instrText>
+      </w:r>
+      <w:r>
+        <w:instrText xml:space="preserve"> \* </w:instrText>
+      </w:r>
+      <w:r>
+        <w:rPr>
+          <w:lang w:val="en-US"/>
+        </w:rPr>
+        <w:instrText>ARABIC</w:instrText>
+      </w:r>
+      <w:r>
+        <w:instrText xml:space="preserve"> \</w:instrText>
+      </w:r>
+      <w:r>
+        <w:rPr>
+          <w:lang w:val="en-US"/>
+        </w:rPr>
+        <w:instrText>s</w:instrText>
+      </w:r>
+      <w:r>
+        <w:instrText xml:space="preserve"> 1 </w:instrText>
+      </w:r>
+      <w:r>
+        <w:fldChar w:fldCharType="separate"/>
+      </w:r>
+      <w:r>
+        <w:rPr>
+          <w:noProof/>
+        </w:rPr>
+        <w:t>2</w:t>
+      </w:r>
+      <w:r>
+        <w:rPr>
+          <w:noProof/>
+        </w:rPr>
         <w:fldChar w:fldCharType="end"/>
       </w:r>
       <w:r>
-        <w:noBreakHyphen/>
-      </w:r>
-      <w:r>
-        <w:fldChar w:fldCharType="begin"/>
-      </w:r>
-      <w:r>
-        <w:instrText xml:space="preserve"> </w:instrText>
+        <w:t xml:space="preserve">. </w:t>
+      </w:r>
+      <w:r>
+        <w:t>Окно свойств интерполяции усилий</w:t>
+      </w:r>
+      <w:bookmarkEnd w:id="78"/>
+    </w:p>
+    <w:p>
+      <w:r>
+        <w:t xml:space="preserve">В результате расчета данных для диаграммы будет выдано окно графиков со всеми доступными для построения диаграммы. Например, для построения диаграммы «момент-кривизна» для момента относительно оси </w:t>
       </w:r>
       <w:r>
         <w:rPr>
           <w:lang w:val="en-US"/>
         </w:rPr>
-        <w:instrText>SEQ</w:instrText>
-      </w:r>
-      <w:r>
-        <w:instrText xml:space="preserve"> </w:instrText>
-      </w:r>
-      <w:r>
-        <w:instrText>Рисунок</w:instrText>
-      </w:r>
-      <w:r>
-        <w:instrText xml:space="preserve"> \* </w:instrText>
-      </w:r>
+        <w:t>X</w:t>
+      </w:r>
+      <w:r>
+        <w:t xml:space="preserve"> выберите для горизонтальной оси графика параметр </w:t>
+      </w:r>
+      <w:proofErr w:type="spellStart"/>
       <w:r>
         <w:rPr>
           <w:lang w:val="en-US"/>
         </w:rPr>
-        <w:instrText>ARABIC</w:instrText>
-      </w:r>
-      <w:r>
-        <w:instrText xml:space="preserve"> \</w:instrText>
+        <w:t>Kx</w:t>
+      </w:r>
+      <w:proofErr w:type="spellEnd"/>
+      <w:r>
+        <w:t xml:space="preserve">, а для вертикальной оси графика выберите параметр </w:t>
       </w:r>
       <w:r>
         <w:rPr>
           <w:lang w:val="en-US"/>
         </w:rPr>
-        <w:instrText>s</w:instrText>
-      </w:r>
-      <w:r>
-        <w:instrText xml:space="preserve"> 1 </w:instrText>
-      </w:r>
-      <w:r>
-        <w:fldChar w:fldCharType="separate"/>
-      </w:r>
-      <w:r>
-        <w:rPr>
-          <w:noProof/>
+        <w:t>Mx</w:t>
+      </w:r>
+      <w:r>
+        <w:t xml:space="preserve">. Учитывайте, что все данные для графика выводятся в виде плоской таблицы, т.е. теоретически вы можете построить график, например, в осях </w:t>
+      </w:r>
+      <w:proofErr w:type="spellStart"/>
+      <w:r>
+        <w:rPr>
           <w:lang w:val="en-US"/>
         </w:rPr>
-        <w:t>2</w:t>
-      </w:r>
-      <w:r>
-        <w:rPr>
-          <w:noProof/>
-        </w:rPr>
-        <w:fldChar w:fldCharType="end"/>
-      </w:r>
-      <w:r>
-        <w:t xml:space="preserve">. </w:t>
-      </w:r>
-      <w:r>
-        <w:t>Окно свойств интерполяции усилий</w:t>
-      </w:r>
-      <w:bookmarkEnd w:id="78"/>
-    </w:p>
-    <w:p>
-      <w:r>
-        <w:t xml:space="preserve">В результате расчета данных для диаграммы будет выдано окно графиков со всеми доступными для построения диаграммы. Например, для построения диаграммы «момент-кривизна» для момента относительно оси </w:t>
-      </w:r>
+        <w:t>Kx</w:t>
+      </w:r>
+      <w:proofErr w:type="spellEnd"/>
+      <w:r>
+        <w:t>-</w:t>
+      </w:r>
+      <w:proofErr w:type="spellStart"/>
       <w:r>
         <w:rPr>
           <w:lang w:val="en-US"/>
         </w:rPr>
-        <w:t>X</w:t>
-      </w:r>
-      <w:r>
-        <w:t xml:space="preserve"> выберите для горизонтальной оси графика параметр </w:t>
-      </w:r>
-      <w:r>
-        <w:rPr>
-          <w:lang w:val="en-US"/>
-        </w:rPr>
-        <w:t>Kx</w:t>
-      </w:r>
-      <w:r>
-        <w:t xml:space="preserve">, а для вертикальной оси графика выберите параметр </w:t>
-      </w:r>
-      <w:r>
-        <w:rPr>
-          <w:lang w:val="en-US"/>
-        </w:rPr>
-        <w:t>Mx</w:t>
-      </w:r>
-      <w:r>
-        <w:t xml:space="preserve">. Учитывайте, что все данные для графика выводятся в виде плоской таблицы, т.е. теоретически вы можете построить график, например, в осях </w:t>
-      </w:r>
-      <w:r>
-        <w:rPr>
-          <w:lang w:val="en-US"/>
-        </w:rPr>
-        <w:t>Kx</w:t>
-      </w:r>
-      <w:r>
-        <w:t>-</w:t>
-      </w:r>
-      <w:r>
-        <w:rPr>
-          <w:lang w:val="en-US"/>
-        </w:rPr>
         <w:t>Nz</w:t>
       </w:r>
+      <w:proofErr w:type="spellEnd"/>
       <w:r>
         <w:t xml:space="preserve"> даже если для вашего сечения эти параметры не являются зависимыми.</w:t>
       </w:r>
@@ -24633,50 +24882,49 @@
       <w:r>
         <w:rPr>
           <w:noProof/>
+        </w:rPr>
+        <w:t>13</w:t>
+      </w:r>
+      <w:r>
+        <w:fldChar w:fldCharType="end"/>
+      </w:r>
+      <w:r>
+        <w:noBreakHyphen/>
+      </w:r>
+      <w:r>
+        <w:fldChar w:fldCharType="begin"/>
+      </w:r>
+      <w:r>
+        <w:instrText xml:space="preserve"> </w:instrText>
+      </w:r>
+      <w:r>
+        <w:rPr>
           <w:lang w:val="en-US"/>
         </w:rPr>
-        <w:t>13</w:t>
-      </w:r>
-      <w:r>
-        <w:fldChar w:fldCharType="end"/>
-      </w:r>
-      <w:r>
-        <w:noBreakHyphen/>
-      </w:r>
-      <w:r>
-        <w:fldChar w:fldCharType="begin"/>
+        <w:instrText>SEQ</w:instrText>
       </w:r>
       <w:r>
         <w:instrText xml:space="preserve"> </w:instrText>
       </w:r>
       <w:r>
+        <w:instrText>Рисунок</w:instrText>
+      </w:r>
+      <w:r>
+        <w:instrText xml:space="preserve"> \* </w:instrText>
+      </w:r>
+      <w:r>
         <w:rPr>
           <w:lang w:val="en-US"/>
         </w:rPr>
-        <w:instrText>SEQ</w:instrText>
-      </w:r>
-      <w:r>
-        <w:instrText xml:space="preserve"> </w:instrText>
-      </w:r>
-      <w:r>
-        <w:instrText>Рисунок</w:instrText>
-      </w:r>
-      <w:r>
-        <w:instrText xml:space="preserve"> \* </w:instrText>
+        <w:instrText>ARABIC</w:instrText>
+      </w:r>
+      <w:r>
+        <w:instrText xml:space="preserve"> \</w:instrText>
       </w:r>
       <w:r>
         <w:rPr>
           <w:lang w:val="en-US"/>
         </w:rPr>
-        <w:instrText>ARABIC</w:instrText>
-      </w:r>
-      <w:r>
-        <w:instrText xml:space="preserve"> \</w:instrText>
-      </w:r>
-      <w:r>
-        <w:rPr>
-          <w:lang w:val="en-US"/>
-        </w:rPr>
         <w:instrText>s</w:instrText>
       </w:r>
       <w:r>
@@ -24688,7 +24936,6 @@
       <w:r>
         <w:rPr>
           <w:noProof/>
-          <w:lang w:val="en-US"/>
         </w:rPr>
         <w:t>3</w:t>
       </w:r>
@@ -24810,50 +25057,49 @@
       <w:r>
         <w:rPr>
           <w:noProof/>
+        </w:rPr>
+        <w:t>13</w:t>
+      </w:r>
+      <w:r>
+        <w:fldChar w:fldCharType="end"/>
+      </w:r>
+      <w:r>
+        <w:noBreakHyphen/>
+      </w:r>
+      <w:r>
+        <w:fldChar w:fldCharType="begin"/>
+      </w:r>
+      <w:r>
+        <w:instrText xml:space="preserve"> </w:instrText>
+      </w:r>
+      <w:r>
+        <w:rPr>
           <w:lang w:val="en-US"/>
         </w:rPr>
-        <w:t>13</w:t>
-      </w:r>
-      <w:r>
-        <w:fldChar w:fldCharType="end"/>
-      </w:r>
-      <w:r>
-        <w:noBreakHyphen/>
-      </w:r>
-      <w:r>
-        <w:fldChar w:fldCharType="begin"/>
+        <w:instrText>SEQ</w:instrText>
       </w:r>
       <w:r>
         <w:instrText xml:space="preserve"> </w:instrText>
       </w:r>
       <w:r>
+        <w:instrText>Рисунок</w:instrText>
+      </w:r>
+      <w:r>
+        <w:instrText xml:space="preserve"> \* </w:instrText>
+      </w:r>
+      <w:r>
         <w:rPr>
           <w:lang w:val="en-US"/>
         </w:rPr>
-        <w:instrText>SEQ</w:instrText>
-      </w:r>
-      <w:r>
-        <w:instrText xml:space="preserve"> </w:instrText>
-      </w:r>
-      <w:r>
-        <w:instrText>Рисунок</w:instrText>
-      </w:r>
-      <w:r>
-        <w:instrText xml:space="preserve"> \* </w:instrText>
+        <w:instrText>ARABIC</w:instrText>
+      </w:r>
+      <w:r>
+        <w:instrText xml:space="preserve"> \</w:instrText>
       </w:r>
       <w:r>
         <w:rPr>
           <w:lang w:val="en-US"/>
         </w:rPr>
-        <w:instrText>ARABIC</w:instrText>
-      </w:r>
-      <w:r>
-        <w:instrText xml:space="preserve"> \</w:instrText>
-      </w:r>
-      <w:r>
-        <w:rPr>
-          <w:lang w:val="en-US"/>
-        </w:rPr>
         <w:instrText>s</w:instrText>
       </w:r>
       <w:r>
@@ -24865,7 +25111,6 @@
       <w:r>
         <w:rPr>
           <w:noProof/>
-          <w:lang w:val="en-US"/>
         </w:rPr>
         <w:t>4</w:t>
       </w:r>
@@ -25171,50 +25416,49 @@
       <w:r>
         <w:rPr>
           <w:noProof/>
+        </w:rPr>
+        <w:t>13</w:t>
+      </w:r>
+      <w:r>
+        <w:fldChar w:fldCharType="end"/>
+      </w:r>
+      <w:r>
+        <w:noBreakHyphen/>
+      </w:r>
+      <w:r>
+        <w:fldChar w:fldCharType="begin"/>
+      </w:r>
+      <w:r>
+        <w:instrText xml:space="preserve"> </w:instrText>
+      </w:r>
+      <w:r>
+        <w:rPr>
           <w:lang w:val="en-US"/>
         </w:rPr>
-        <w:t>13</w:t>
-      </w:r>
-      <w:r>
-        <w:fldChar w:fldCharType="end"/>
-      </w:r>
-      <w:r>
-        <w:noBreakHyphen/>
-      </w:r>
-      <w:r>
-        <w:fldChar w:fldCharType="begin"/>
+        <w:instrText>SEQ</w:instrText>
       </w:r>
       <w:r>
         <w:instrText xml:space="preserve"> </w:instrText>
       </w:r>
       <w:r>
+        <w:instrText>Рисунок</w:instrText>
+      </w:r>
+      <w:r>
+        <w:instrText xml:space="preserve"> \* </w:instrText>
+      </w:r>
+      <w:r>
         <w:rPr>
           <w:lang w:val="en-US"/>
         </w:rPr>
-        <w:instrText>SEQ</w:instrText>
-      </w:r>
-      <w:r>
-        <w:instrText xml:space="preserve"> </w:instrText>
-      </w:r>
-      <w:r>
-        <w:instrText>Рисунок</w:instrText>
-      </w:r>
-      <w:r>
-        <w:instrText xml:space="preserve"> \* </w:instrText>
+        <w:instrText>ARABIC</w:instrText>
+      </w:r>
+      <w:r>
+        <w:instrText xml:space="preserve"> \</w:instrText>
       </w:r>
       <w:r>
         <w:rPr>
           <w:lang w:val="en-US"/>
         </w:rPr>
-        <w:instrText>ARABIC</w:instrText>
-      </w:r>
-      <w:r>
-        <w:instrText xml:space="preserve"> \</w:instrText>
-      </w:r>
-      <w:r>
-        <w:rPr>
-          <w:lang w:val="en-US"/>
-        </w:rPr>
         <w:instrText>s</w:instrText>
       </w:r>
       <w:r>
@@ -25226,7 +25470,6 @@
       <w:r>
         <w:rPr>
           <w:noProof/>
-          <w:lang w:val="en-US"/>
         </w:rPr>
         <w:t>6</w:t>
       </w:r>
@@ -25348,50 +25591,49 @@
       <w:r>
         <w:rPr>
           <w:noProof/>
+        </w:rPr>
+        <w:t>13</w:t>
+      </w:r>
+      <w:r>
+        <w:fldChar w:fldCharType="end"/>
+      </w:r>
+      <w:r>
+        <w:noBreakHyphen/>
+      </w:r>
+      <w:r>
+        <w:fldChar w:fldCharType="begin"/>
+      </w:r>
+      <w:r>
+        <w:instrText xml:space="preserve"> </w:instrText>
+      </w:r>
+      <w:r>
+        <w:rPr>
           <w:lang w:val="en-US"/>
         </w:rPr>
-        <w:t>13</w:t>
-      </w:r>
-      <w:r>
-        <w:fldChar w:fldCharType="end"/>
-      </w:r>
-      <w:r>
-        <w:noBreakHyphen/>
-      </w:r>
-      <w:r>
-        <w:fldChar w:fldCharType="begin"/>
+        <w:instrText>SEQ</w:instrText>
       </w:r>
       <w:r>
         <w:instrText xml:space="preserve"> </w:instrText>
       </w:r>
       <w:r>
+        <w:instrText>Рисунок</w:instrText>
+      </w:r>
+      <w:r>
+        <w:instrText xml:space="preserve"> \* </w:instrText>
+      </w:r>
+      <w:r>
         <w:rPr>
           <w:lang w:val="en-US"/>
         </w:rPr>
-        <w:instrText>SEQ</w:instrText>
-      </w:r>
-      <w:r>
-        <w:instrText xml:space="preserve"> </w:instrText>
-      </w:r>
-      <w:r>
-        <w:instrText>Рисунок</w:instrText>
-      </w:r>
-      <w:r>
-        <w:instrText xml:space="preserve"> \* </w:instrText>
+        <w:instrText>ARABIC</w:instrText>
+      </w:r>
+      <w:r>
+        <w:instrText xml:space="preserve"> \</w:instrText>
       </w:r>
       <w:r>
         <w:rPr>
           <w:lang w:val="en-US"/>
         </w:rPr>
-        <w:instrText>ARABIC</w:instrText>
-      </w:r>
-      <w:r>
-        <w:instrText xml:space="preserve"> \</w:instrText>
-      </w:r>
-      <w:r>
-        <w:rPr>
-          <w:lang w:val="en-US"/>
-        </w:rPr>
         <w:instrText>s</w:instrText>
       </w:r>
       <w:r>
@@ -25403,7 +25645,6 @@
       <w:r>
         <w:rPr>
           <w:noProof/>
-          <w:lang w:val="en-US"/>
         </w:rPr>
         <w:t>7</w:t>
       </w:r>
@@ -25447,7 +25688,15 @@
       </w:pPr>
       <w:bookmarkStart w:id="86" w:name="_Toc203333363"/>
       <w:r>
-        <w:t>Расчет сборной железобетонной круглопустотной плиты</w:t>
+        <w:t xml:space="preserve">Расчет сборной железобетонной </w:t>
+      </w:r>
+      <w:proofErr w:type="spellStart"/>
+      <w:r>
+        <w:t>круглопустотной</w:t>
+      </w:r>
+      <w:proofErr w:type="spellEnd"/>
+      <w:r>
+        <w:t xml:space="preserve"> плиты</w:t>
       </w:r>
       <w:r>
         <w:t xml:space="preserve"> перекрытия</w:t>
@@ -25962,50 +26211,49 @@
       <w:r>
         <w:rPr>
           <w:noProof/>
+        </w:rPr>
+        <w:t>14</w:t>
+      </w:r>
+      <w:r>
+        <w:fldChar w:fldCharType="end"/>
+      </w:r>
+      <w:r>
+        <w:noBreakHyphen/>
+      </w:r>
+      <w:r>
+        <w:fldChar w:fldCharType="begin"/>
+      </w:r>
+      <w:r>
+        <w:instrText xml:space="preserve"> </w:instrText>
+      </w:r>
+      <w:r>
+        <w:rPr>
           <w:lang w:val="en-US"/>
         </w:rPr>
-        <w:t>14</w:t>
-      </w:r>
-      <w:r>
-        <w:fldChar w:fldCharType="end"/>
-      </w:r>
-      <w:r>
-        <w:noBreakHyphen/>
-      </w:r>
-      <w:r>
-        <w:fldChar w:fldCharType="begin"/>
+        <w:instrText>SEQ</w:instrText>
       </w:r>
       <w:r>
         <w:instrText xml:space="preserve"> </w:instrText>
       </w:r>
       <w:r>
+        <w:instrText>Рисунок</w:instrText>
+      </w:r>
+      <w:r>
+        <w:instrText xml:space="preserve"> \* </w:instrText>
+      </w:r>
+      <w:r>
         <w:rPr>
           <w:lang w:val="en-US"/>
         </w:rPr>
-        <w:instrText>SEQ</w:instrText>
-      </w:r>
-      <w:r>
-        <w:instrText xml:space="preserve"> </w:instrText>
-      </w:r>
-      <w:r>
-        <w:instrText>Рисунок</w:instrText>
-      </w:r>
-      <w:r>
-        <w:instrText xml:space="preserve"> \* </w:instrText>
+        <w:instrText>ARABIC</w:instrText>
+      </w:r>
+      <w:r>
+        <w:instrText xml:space="preserve"> \</w:instrText>
       </w:r>
       <w:r>
         <w:rPr>
           <w:lang w:val="en-US"/>
         </w:rPr>
-        <w:instrText>ARABIC</w:instrText>
-      </w:r>
-      <w:r>
-        <w:instrText xml:space="preserve"> \</w:instrText>
-      </w:r>
-      <w:r>
-        <w:rPr>
-          <w:lang w:val="en-US"/>
-        </w:rPr>
         <w:instrText>s</w:instrText>
       </w:r>
       <w:r>
@@ -26017,7 +26265,6 @@
       <w:r>
         <w:rPr>
           <w:noProof/>
-          <w:lang w:val="en-US"/>
         </w:rPr>
         <w:t>2</w:t>
       </w:r>
@@ -26166,7 +26413,15 @@
         <w:t>.</w:t>
       </w:r>
       <w:r>
-        <w:t xml:space="preserve"> Поперечное сечение круглопустотной плиты</w:t>
+        <w:t xml:space="preserve"> Поперечное сечение </w:t>
+      </w:r>
+      <w:proofErr w:type="spellStart"/>
+      <w:r>
+        <w:t>круглопустотной</w:t>
+      </w:r>
+      <w:proofErr w:type="spellEnd"/>
+      <w:r>
+        <w:t xml:space="preserve"> плиты</w:t>
       </w:r>
       <w:bookmarkEnd w:id="89"/>
     </w:p>
@@ -26278,50 +26533,49 @@
       <w:r>
         <w:rPr>
           <w:noProof/>
+        </w:rPr>
+        <w:t>14</w:t>
+      </w:r>
+      <w:r>
+        <w:fldChar w:fldCharType="end"/>
+      </w:r>
+      <w:r>
+        <w:noBreakHyphen/>
+      </w:r>
+      <w:r>
+        <w:fldChar w:fldCharType="begin"/>
+      </w:r>
+      <w:r>
+        <w:instrText xml:space="preserve"> </w:instrText>
+      </w:r>
+      <w:r>
+        <w:rPr>
           <w:lang w:val="en-US"/>
         </w:rPr>
-        <w:t>14</w:t>
-      </w:r>
-      <w:r>
-        <w:fldChar w:fldCharType="end"/>
-      </w:r>
-      <w:r>
-        <w:noBreakHyphen/>
-      </w:r>
-      <w:r>
-        <w:fldChar w:fldCharType="begin"/>
+        <w:instrText>SEQ</w:instrText>
       </w:r>
       <w:r>
         <w:instrText xml:space="preserve"> </w:instrText>
       </w:r>
       <w:r>
+        <w:instrText>Рисунок</w:instrText>
+      </w:r>
+      <w:r>
+        <w:instrText xml:space="preserve"> \* </w:instrText>
+      </w:r>
+      <w:r>
         <w:rPr>
           <w:lang w:val="en-US"/>
         </w:rPr>
-        <w:instrText>SEQ</w:instrText>
-      </w:r>
-      <w:r>
-        <w:instrText xml:space="preserve"> </w:instrText>
-      </w:r>
-      <w:r>
-        <w:instrText>Рисунок</w:instrText>
-      </w:r>
-      <w:r>
-        <w:instrText xml:space="preserve"> \* </w:instrText>
+        <w:instrText>ARABIC</w:instrText>
+      </w:r>
+      <w:r>
+        <w:instrText xml:space="preserve"> \</w:instrText>
       </w:r>
       <w:r>
         <w:rPr>
           <w:lang w:val="en-US"/>
         </w:rPr>
-        <w:instrText>ARABIC</w:instrText>
-      </w:r>
-      <w:r>
-        <w:instrText xml:space="preserve"> \</w:instrText>
-      </w:r>
-      <w:r>
-        <w:rPr>
-          <w:lang w:val="en-US"/>
-        </w:rPr>
         <w:instrText>s</w:instrText>
       </w:r>
       <w:r>
@@ -26333,7 +26587,6 @@
       <w:r>
         <w:rPr>
           <w:noProof/>
-          <w:lang w:val="en-US"/>
         </w:rPr>
         <w:t>4</w:t>
       </w:r>
@@ -26880,7 +27133,21 @@
         <w:rPr>
           <w:lang w:val="en-US"/>
         </w:rPr>
-        <w:t>“Triplelinear”)</w:t>
+        <w:t>“</w:t>
+      </w:r>
+      <w:proofErr w:type="spellStart"/>
+      <w:r>
+        <w:rPr>
+          <w:lang w:val="en-US"/>
+        </w:rPr>
+        <w:t>Triplelinear</w:t>
+      </w:r>
+      <w:proofErr w:type="spellEnd"/>
+      <w:r>
+        <w:rPr>
+          <w:lang w:val="en-US"/>
+        </w:rPr>
+        <w:t>”)</w:t>
       </w:r>
       <w:r>
         <w:t>.</w:t>
@@ -27481,72 +27748,70 @@
       <w:r>
         <w:rPr>
           <w:noProof/>
+        </w:rPr>
+        <w:t>14</w:t>
+      </w:r>
+      <w:r>
+        <w:fldChar w:fldCharType="end"/>
+      </w:r>
+      <w:r>
+        <w:noBreakHyphen/>
+      </w:r>
+      <w:r>
+        <w:fldChar w:fldCharType="begin"/>
+      </w:r>
+      <w:r>
+        <w:instrText xml:space="preserve"> </w:instrText>
+      </w:r>
+      <w:r>
+        <w:rPr>
           <w:lang w:val="en-US"/>
         </w:rPr>
-        <w:t>14</w:t>
-      </w:r>
-      <w:r>
+        <w:instrText>SEQ</w:instrText>
+      </w:r>
+      <w:r>
+        <w:instrText xml:space="preserve"> </w:instrText>
+      </w:r>
+      <w:r>
+        <w:instrText>Рисунок</w:instrText>
+      </w:r>
+      <w:r>
+        <w:instrText xml:space="preserve"> \* </w:instrText>
+      </w:r>
+      <w:r>
+        <w:rPr>
+          <w:lang w:val="en-US"/>
+        </w:rPr>
+        <w:instrText>ARABIC</w:instrText>
+      </w:r>
+      <w:r>
+        <w:instrText xml:space="preserve"> \</w:instrText>
+      </w:r>
+      <w:r>
+        <w:rPr>
+          <w:lang w:val="en-US"/>
+        </w:rPr>
+        <w:instrText>s</w:instrText>
+      </w:r>
+      <w:r>
+        <w:instrText xml:space="preserve"> 1 </w:instrText>
+      </w:r>
+      <w:r>
+        <w:fldChar w:fldCharType="separate"/>
+      </w:r>
+      <w:r>
+        <w:rPr>
+          <w:noProof/>
+        </w:rPr>
+        <w:t>10</w:t>
+      </w:r>
+      <w:r>
+        <w:rPr>
+          <w:noProof/>
+        </w:rPr>
         <w:fldChar w:fldCharType="end"/>
       </w:r>
       <w:r>
-        <w:noBreakHyphen/>
-      </w:r>
-      <w:r>
-        <w:fldChar w:fldCharType="begin"/>
-      </w:r>
-      <w:r>
-        <w:instrText xml:space="preserve"> </w:instrText>
-      </w:r>
-      <w:r>
-        <w:rPr>
-          <w:lang w:val="en-US"/>
-        </w:rPr>
-        <w:instrText>SEQ</w:instrText>
-      </w:r>
-      <w:r>
-        <w:instrText xml:space="preserve"> </w:instrText>
-      </w:r>
-      <w:r>
-        <w:instrText>Рисунок</w:instrText>
-      </w:r>
-      <w:r>
-        <w:instrText xml:space="preserve"> \* </w:instrText>
-      </w:r>
-      <w:r>
-        <w:rPr>
-          <w:lang w:val="en-US"/>
-        </w:rPr>
-        <w:instrText>ARABIC</w:instrText>
-      </w:r>
-      <w:r>
-        <w:instrText xml:space="preserve"> \</w:instrText>
-      </w:r>
-      <w:r>
-        <w:rPr>
-          <w:lang w:val="en-US"/>
-        </w:rPr>
-        <w:instrText>s</w:instrText>
-      </w:r>
-      <w:r>
-        <w:instrText xml:space="preserve"> 1 </w:instrText>
-      </w:r>
-      <w:r>
-        <w:fldChar w:fldCharType="separate"/>
-      </w:r>
-      <w:r>
-        <w:rPr>
-          <w:noProof/>
-          <w:lang w:val="en-US"/>
-        </w:rPr>
-        <w:t>10</w:t>
-      </w:r>
-      <w:r>
-        <w:rPr>
-          <w:noProof/>
-        </w:rPr>
-        <w:fldChar w:fldCharType="end"/>
-      </w:r>
-      <w:r>
         <w:t>.</w:t>
       </w:r>
       <w:r>
@@ -27572,12 +27837,14 @@
         </w:rPr>
         <w:t xml:space="preserve"> </w:t>
       </w:r>
+      <w:proofErr w:type="spellStart"/>
       <w:r>
         <w:rPr>
           <w:lang w:eastAsia="ru-RU"/>
         </w:rPr>
         <w:t>проинтерполируем</w:t>
       </w:r>
+      <w:proofErr w:type="spellEnd"/>
       <w:r>
         <w:rPr>
           <w:lang w:eastAsia="ru-RU"/>
@@ -27728,50 +27995,49 @@
       <w:r>
         <w:rPr>
           <w:noProof/>
+        </w:rPr>
+        <w:t>14</w:t>
+      </w:r>
+      <w:r>
+        <w:fldChar w:fldCharType="end"/>
+      </w:r>
+      <w:r>
+        <w:noBreakHyphen/>
+      </w:r>
+      <w:r>
+        <w:fldChar w:fldCharType="begin"/>
+      </w:r>
+      <w:r>
+        <w:instrText xml:space="preserve"> </w:instrText>
+      </w:r>
+      <w:r>
+        <w:rPr>
           <w:lang w:val="en-US"/>
         </w:rPr>
-        <w:t>14</w:t>
-      </w:r>
-      <w:r>
-        <w:fldChar w:fldCharType="end"/>
-      </w:r>
-      <w:r>
-        <w:noBreakHyphen/>
-      </w:r>
-      <w:r>
-        <w:fldChar w:fldCharType="begin"/>
+        <w:instrText>SEQ</w:instrText>
       </w:r>
       <w:r>
         <w:instrText xml:space="preserve"> </w:instrText>
       </w:r>
       <w:r>
+        <w:instrText>Рисунок</w:instrText>
+      </w:r>
+      <w:r>
+        <w:instrText xml:space="preserve"> \* </w:instrText>
+      </w:r>
+      <w:r>
         <w:rPr>
           <w:lang w:val="en-US"/>
         </w:rPr>
-        <w:instrText>SEQ</w:instrText>
-      </w:r>
-      <w:r>
-        <w:instrText xml:space="preserve"> </w:instrText>
-      </w:r>
-      <w:r>
-        <w:instrText>Рисунок</w:instrText>
-      </w:r>
-      <w:r>
-        <w:instrText xml:space="preserve"> \* </w:instrText>
+        <w:instrText>ARABIC</w:instrText>
+      </w:r>
+      <w:r>
+        <w:instrText xml:space="preserve"> \</w:instrText>
       </w:r>
       <w:r>
         <w:rPr>
           <w:lang w:val="en-US"/>
         </w:rPr>
-        <w:instrText>ARABIC</w:instrText>
-      </w:r>
-      <w:r>
-        <w:instrText xml:space="preserve"> \</w:instrText>
-      </w:r>
-      <w:r>
-        <w:rPr>
-          <w:lang w:val="en-US"/>
-        </w:rPr>
         <w:instrText>s</w:instrText>
       </w:r>
       <w:r>
@@ -27783,7 +28049,6 @@
       <w:r>
         <w:rPr>
           <w:noProof/>
-          <w:lang w:val="en-US"/>
         </w:rPr>
         <w:t>11</w:t>
       </w:r>
@@ -27914,50 +28179,49 @@
       <w:r>
         <w:rPr>
           <w:noProof/>
+        </w:rPr>
+        <w:t>14</w:t>
+      </w:r>
+      <w:r>
+        <w:fldChar w:fldCharType="end"/>
+      </w:r>
+      <w:r>
+        <w:noBreakHyphen/>
+      </w:r>
+      <w:r>
+        <w:fldChar w:fldCharType="begin"/>
+      </w:r>
+      <w:r>
+        <w:instrText xml:space="preserve"> </w:instrText>
+      </w:r>
+      <w:r>
+        <w:rPr>
           <w:lang w:val="en-US"/>
         </w:rPr>
-        <w:t>14</w:t>
-      </w:r>
-      <w:r>
-        <w:fldChar w:fldCharType="end"/>
-      </w:r>
-      <w:r>
-        <w:noBreakHyphen/>
-      </w:r>
-      <w:r>
-        <w:fldChar w:fldCharType="begin"/>
+        <w:instrText>SEQ</w:instrText>
       </w:r>
       <w:r>
         <w:instrText xml:space="preserve"> </w:instrText>
       </w:r>
       <w:r>
+        <w:instrText>Рисунок</w:instrText>
+      </w:r>
+      <w:r>
+        <w:instrText xml:space="preserve"> \* </w:instrText>
+      </w:r>
+      <w:r>
         <w:rPr>
           <w:lang w:val="en-US"/>
         </w:rPr>
-        <w:instrText>SEQ</w:instrText>
-      </w:r>
-      <w:r>
-        <w:instrText xml:space="preserve"> </w:instrText>
-      </w:r>
-      <w:r>
-        <w:instrText>Рисунок</w:instrText>
-      </w:r>
-      <w:r>
-        <w:instrText xml:space="preserve"> \* </w:instrText>
+        <w:instrText>ARABIC</w:instrText>
+      </w:r>
+      <w:r>
+        <w:instrText xml:space="preserve"> \</w:instrText>
       </w:r>
       <w:r>
         <w:rPr>
           <w:lang w:val="en-US"/>
         </w:rPr>
-        <w:instrText>ARABIC</w:instrText>
-      </w:r>
-      <w:r>
-        <w:instrText xml:space="preserve"> \</w:instrText>
-      </w:r>
-      <w:r>
-        <w:rPr>
-          <w:lang w:val="en-US"/>
-        </w:rPr>
         <w:instrText>s</w:instrText>
       </w:r>
       <w:r>
@@ -27969,7 +28233,6 @@
       <w:r>
         <w:rPr>
           <w:noProof/>
-          <w:lang w:val="en-US"/>
         </w:rPr>
         <w:t>12</w:t>
       </w:r>
@@ -28117,72 +28380,70 @@
       <w:r>
         <w:rPr>
           <w:noProof/>
+        </w:rPr>
+        <w:t>14</w:t>
+      </w:r>
+      <w:r>
+        <w:fldChar w:fldCharType="end"/>
+      </w:r>
+      <w:r>
+        <w:noBreakHyphen/>
+      </w:r>
+      <w:r>
+        <w:fldChar w:fldCharType="begin"/>
+      </w:r>
+      <w:r>
+        <w:instrText xml:space="preserve"> </w:instrText>
+      </w:r>
+      <w:r>
+        <w:rPr>
           <w:lang w:val="en-US"/>
         </w:rPr>
-        <w:t>14</w:t>
-      </w:r>
-      <w:r>
+        <w:instrText>SEQ</w:instrText>
+      </w:r>
+      <w:r>
+        <w:instrText xml:space="preserve"> </w:instrText>
+      </w:r>
+      <w:r>
+        <w:instrText>Рисунок</w:instrText>
+      </w:r>
+      <w:r>
+        <w:instrText xml:space="preserve"> \* </w:instrText>
+      </w:r>
+      <w:r>
+        <w:rPr>
+          <w:lang w:val="en-US"/>
+        </w:rPr>
+        <w:instrText>ARABIC</w:instrText>
+      </w:r>
+      <w:r>
+        <w:instrText xml:space="preserve"> \</w:instrText>
+      </w:r>
+      <w:r>
+        <w:rPr>
+          <w:lang w:val="en-US"/>
+        </w:rPr>
+        <w:instrText>s</w:instrText>
+      </w:r>
+      <w:r>
+        <w:instrText xml:space="preserve"> 1 </w:instrText>
+      </w:r>
+      <w:r>
+        <w:fldChar w:fldCharType="separate"/>
+      </w:r>
+      <w:r>
+        <w:rPr>
+          <w:noProof/>
+        </w:rPr>
+        <w:t>13</w:t>
+      </w:r>
+      <w:r>
+        <w:rPr>
+          <w:noProof/>
+        </w:rPr>
         <w:fldChar w:fldCharType="end"/>
       </w:r>
       <w:r>
-        <w:noBreakHyphen/>
-      </w:r>
-      <w:r>
-        <w:fldChar w:fldCharType="begin"/>
-      </w:r>
-      <w:r>
-        <w:instrText xml:space="preserve"> </w:instrText>
-      </w:r>
-      <w:r>
-        <w:rPr>
-          <w:lang w:val="en-US"/>
-        </w:rPr>
-        <w:instrText>SEQ</w:instrText>
-      </w:r>
-      <w:r>
-        <w:instrText xml:space="preserve"> </w:instrText>
-      </w:r>
-      <w:r>
-        <w:instrText>Рисунок</w:instrText>
-      </w:r>
-      <w:r>
-        <w:instrText xml:space="preserve"> \* </w:instrText>
-      </w:r>
-      <w:r>
-        <w:rPr>
-          <w:lang w:val="en-US"/>
-        </w:rPr>
-        <w:instrText>ARABIC</w:instrText>
-      </w:r>
-      <w:r>
-        <w:instrText xml:space="preserve"> \</w:instrText>
-      </w:r>
-      <w:r>
-        <w:rPr>
-          <w:lang w:val="en-US"/>
-        </w:rPr>
-        <w:instrText>s</w:instrText>
-      </w:r>
-      <w:r>
-        <w:instrText xml:space="preserve"> 1 </w:instrText>
-      </w:r>
-      <w:r>
-        <w:fldChar w:fldCharType="separate"/>
-      </w:r>
-      <w:r>
-        <w:rPr>
-          <w:noProof/>
-          <w:lang w:val="en-US"/>
-        </w:rPr>
-        <w:t>13</w:t>
-      </w:r>
-      <w:r>
-        <w:rPr>
-          <w:noProof/>
-        </w:rPr>
-        <w:fldChar w:fldCharType="end"/>
-      </w:r>
-      <w:r>
         <w:t>.</w:t>
       </w:r>
       <w:r>
@@ -28229,9 +28490,14 @@
       <w:pPr>
         <w:pStyle w:val="a3"/>
       </w:pPr>
+      <w:proofErr w:type="gramStart"/>
       <w:r>
         <w:lastRenderedPageBreak/>
-        <w:t>Возможно вы отметили, что полученная сетка элементарных участков слишком грубая, в этом случае мы можем отредактировать свойства прямоугольного примитива основного сечения плиты и установить необходимые параметры для триангуляции.</w:t>
+        <w:t>Возможно</w:t>
+      </w:r>
+      <w:proofErr w:type="gramEnd"/>
+      <w:r>
+        <w:t xml:space="preserve"> вы отметили, что полученная сетка элементарных участков слишком грубая, в этом случае мы можем отредактировать свойства прямоугольного примитива основного сечения плиты и установить необходимые параметры для триангуляции.</w:t>
       </w:r>
     </w:p>
     <w:p>
@@ -28243,7 +28509,15 @@
         </w:numPr>
       </w:pPr>
       <w:r>
-        <w:t>В коне результатов выберем строку, соответствующую длительной нагрузке для предельных состояний 2-й группы и построим диаграмму «момент-кривизна»</w:t>
+        <w:t xml:space="preserve">В коне результатов выберем строку, соответствующую длительной нагрузке для предельных состояний </w:t>
+      </w:r>
+      <w:proofErr w:type="gramStart"/>
+      <w:r>
+        <w:t>2-й группы</w:t>
+      </w:r>
+      <w:proofErr w:type="gramEnd"/>
+      <w:r>
+        <w:t xml:space="preserve"> и построим диаграмму «момент-кривизна»</w:t>
       </w:r>
     </w:p>
     <w:p>
@@ -30672,9 +30946,9 @@
       <w:pPr>
         <w:pStyle w:val="1"/>
       </w:pPr>
-      <w:bookmarkStart w:id="118" w:name="_Toc165738898"/>
-      <w:bookmarkStart w:id="119" w:name="_Toc171795689"/>
-      <w:bookmarkStart w:id="120" w:name="_Toc203333365"/>
+      <w:bookmarkStart w:id="118" w:name="_Toc203333365"/>
+      <w:bookmarkStart w:id="119" w:name="_Toc165738898"/>
+      <w:bookmarkStart w:id="120" w:name="_Toc171795689"/>
       <w:r>
         <w:lastRenderedPageBreak/>
         <w:t>Расчет железобетонных стержней по наклонным сечениям (</w:t>
@@ -30706,7 +30980,7 @@
       <w:r>
         <w:t>)</w:t>
       </w:r>
-      <w:bookmarkEnd w:id="120"/>
+      <w:bookmarkEnd w:id="118"/>
     </w:p>
     <w:p>
       <w:pPr>
@@ -31734,7 +32008,15 @@
     </w:p>
     <w:p>
       <w:r>
-        <w:t>В соответствии с СП 63.13330.2018 для определения усилий, действующих в конце наклонного сечения, из опорной реакции следует вычитать нагрузки, приложенные к опорному блоку отделенному рассматриваемой наклонной трещины. Следует учитывать возможность отсутствия рассматриваемой нагрузки в пределах опорного блока, если рассматриваемая нагрузка является условно равномерно-распределенной. Также следует учитывать приложение нагрузки по высоте элемента, так как наклонная трещина отсекает разное расстояние для нагрузок, расположенных на разной высоте.</w:t>
+        <w:t xml:space="preserve">В соответствии с СП 63.13330.2018 для определения усилий, действующих в конце наклонного сечения, из опорной реакции следует вычитать нагрузки, приложенные </w:t>
+      </w:r>
+      <w:proofErr w:type="gramStart"/>
+      <w:r>
+        <w:t>к опорному блоку</w:t>
+      </w:r>
+      <w:proofErr w:type="gramEnd"/>
+      <w:r>
+        <w:t xml:space="preserve"> отделенному рассматриваемой наклонной трещины. Следует учитывать возможность отсутствия рассматриваемой нагрузки в пределах опорного блока, если рассматриваемая нагрузка является условно равномерно-распределенной. Также следует учитывать приложение нагрузки по высоте элемента, так как наклонная трещина отсекает разное расстояние для нагрузок, расположенных на разной высоте.</w:t>
       </w:r>
     </w:p>
     <w:p>
@@ -32197,7 +32479,15 @@
     </w:p>
     <w:p>
       <w:r>
-        <w:t>Для учета особенностей применения материалов по сравнению со стандартными условиями пользователь может указать необходимые коэффициенты условий работы. Коэффициенты условий работы, указанные в СП 63.13330.2018 назначаются автоматически при создании материала.</w:t>
+        <w:t xml:space="preserve">Для учета особенностей применения материалов по сравнению со стандартными условиями пользователь может указать необходимые коэффициенты условий работы. Коэффициенты условий работы, указанные в СП </w:t>
+      </w:r>
+      <w:proofErr w:type="gramStart"/>
+      <w:r>
+        <w:t>63.13330.2018</w:t>
+      </w:r>
+      <w:proofErr w:type="gramEnd"/>
+      <w:r>
+        <w:t xml:space="preserve"> назначаются автоматически при создании материала.</w:t>
       </w:r>
     </w:p>
     <w:p>
@@ -32339,7 +32629,18 @@
     </w:p>
     <w:p>
       <w:r>
-        <w:t>В настоящий момент предусмотрено 2 способа ввода поперечного армирования:</w:t>
+        <w:t xml:space="preserve">В настоящий момент предусмотрено </w:t>
+      </w:r>
+      <w:r>
+        <w:t>несколько способов</w:t>
+      </w:r>
+      <w:r>
+        <w:t xml:space="preserve"> ввода поперечного армирования:</w:t>
+      </w:r>
+    </w:p>
+    <w:p>
+      <w:r>
+        <w:t>- группа элементов поперечного армирования.</w:t>
       </w:r>
     </w:p>
     <w:p>
@@ -32353,11 +32654,34 @@
       </w:r>
     </w:p>
     <w:p>
+      <w:r>
+        <w:t>- поперечное армирование в виде отгибов из арматурной стали.</w:t>
+      </w:r>
+    </w:p>
+    <w:p>
       <w:pPr>
         <w:pStyle w:val="3"/>
       </w:pPr>
       <w:bookmarkStart w:id="140" w:name="_Toc203333376"/>
       <w:r>
+        <w:t>Группа элементов поперечного армирования</w:t>
+      </w:r>
+    </w:p>
+    <w:p>
+      <w:r>
+        <w:t>Группа элементов поперечного армирования предназначена для агрегации других элементов и может включать в себя перечень других элементов (в том чисел других групп). При определении усилия, воспринимаемого группой, вычисляется сумма несущей способности всех элементов для заданного поперечного сечения.</w:t>
+      </w:r>
+    </w:p>
+    <w:p>
+      <w:r>
+        <w:t>Например, группа может включать себя поперечное армирование в виде хомутов, а также несколько видов отгибов. Также группа может включать в себя другие группы, что может быть удобно для понятной организации поперечного армирования, например, в отдельную группу можно выделить поперечное армирование в виде отгибов. Порядок элементов в группе не влияет на сумму несущей способности поперечного армирования и определяет только порядок вычисления несущей способности отдельных элементов.</w:t>
+      </w:r>
+    </w:p>
+    <w:p>
+      <w:pPr>
+        <w:pStyle w:val="3"/>
+      </w:pPr>
+      <w:r>
         <w:t>Распределенное значение по интенсивности</w:t>
       </w:r>
       <w:bookmarkEnd w:id="140"/>
@@ -32369,6 +32693,7 @@
     </w:p>
     <w:p>
       <w:r>
+        <w:lastRenderedPageBreak/>
         <w:t>Важно! Для распределенного значения по интенсивности не учитывается ограничение по максимальному шагу поперечного армирования в соответствии с СП 63.13330.2018.</w:t>
       </w:r>
     </w:p>
@@ -32505,11 +32830,7 @@
     </w:p>
     <w:p>
       <w:r>
-        <w:t xml:space="preserve">Для поперечного армирования в виде хомутов указывается диаметр хомута (от 5мм до 25мм), шаг поперечного армирования и количество ветвей в одном поперечном сечении. Количество ветвей может иметь нецелое значение, что может применяться, например, при расчете плитных и стеновых </w:t>
-      </w:r>
-      <w:r>
-        <w:lastRenderedPageBreak/>
-        <w:t>конструкций при условной и ширине 1м. Например, при шаге хомутов в поперечном сечении плиты 400мм, количество ветвей хомутов для условной ширины 1м равно 2,5.</w:t>
+        <w:t>Для поперечного армирования в виде хомутов указывается диаметр хомута (от 5мм до 25мм), шаг поперечного армирования и количество ветвей в одном поперечном сечении. Количество ветвей может иметь нецелое значение, что может применяться, например, при расчете плитных и стеновых конструкций при условной и ширине 1м. Например, при шаге хомутов в поперечном сечении плиты 400мм, количество ветвей хомутов для условной ширины 1м равно 2,5.</w:t>
       </w:r>
     </w:p>
     <w:p>
@@ -32635,13 +32956,141 @@
     </w:p>
     <w:p>
       <w:pPr>
+        <w:pStyle w:val="3"/>
+        <w:rPr>
+          <w:lang w:eastAsia="ru-RU"/>
+        </w:rPr>
+      </w:pPr>
+      <w:r>
+        <w:rPr>
+          <w:lang w:eastAsia="ru-RU"/>
+        </w:rPr>
+        <w:t>Поперечное армирование в виде отгибов</w:t>
+      </w:r>
+    </w:p>
+    <w:p>
+      <w:pPr>
+        <w:rPr>
+          <w:lang w:eastAsia="ru-RU"/>
+        </w:rPr>
+      </w:pPr>
+      <w:r>
+        <w:rPr>
+          <w:lang w:eastAsia="ru-RU"/>
+        </w:rPr>
+        <w:t>Для поперечного армирования в виде отгибов указываются следующие параметры:</w:t>
+      </w:r>
+    </w:p>
+    <w:p>
+      <w:pPr>
+        <w:rPr>
+          <w:lang w:eastAsia="ru-RU"/>
+        </w:rPr>
+      </w:pPr>
+      <w:r>
+        <w:rPr>
+          <w:lang w:eastAsia="ru-RU"/>
+        </w:rPr>
+        <w:t xml:space="preserve">- </w:t>
+      </w:r>
+      <w:r>
+        <w:rPr>
+          <w:lang w:eastAsia="ru-RU"/>
+        </w:rPr>
+        <w:t>диаметр отгиба и класс арматуры.</w:t>
+      </w:r>
+    </w:p>
+    <w:p>
+      <w:pPr>
+        <w:rPr>
+          <w:lang w:eastAsia="ru-RU"/>
+        </w:rPr>
+      </w:pPr>
+      <w:r>
+        <w:rPr>
+          <w:lang w:eastAsia="ru-RU"/>
+        </w:rPr>
+        <w:t>- количество ветвей (может иметь нецелое значение).</w:t>
+      </w:r>
+    </w:p>
+    <w:p>
+      <w:pPr>
+        <w:rPr>
+          <w:lang w:eastAsia="ru-RU"/>
+        </w:rPr>
+      </w:pPr>
+      <w:r>
+        <w:rPr>
+          <w:lang w:eastAsia="ru-RU"/>
+        </w:rPr>
+        <w:t>- угол наклона отгиба к продольной оси элемента.</w:t>
+      </w:r>
+    </w:p>
+    <w:p>
+      <w:pPr>
+        <w:rPr>
+          <w:lang w:eastAsia="ru-RU"/>
+        </w:rPr>
+      </w:pPr>
+      <w:r>
+        <w:rPr>
+          <w:lang w:eastAsia="ru-RU"/>
+        </w:rPr>
+        <w:t>- координата начала отгиба (расстояние от опоры).</w:t>
+      </w:r>
+    </w:p>
+    <w:p>
+      <w:pPr>
+        <w:rPr>
+          <w:lang w:eastAsia="ru-RU"/>
+        </w:rPr>
+      </w:pPr>
+      <w:r>
+        <w:rPr>
+          <w:lang w:eastAsia="ru-RU"/>
+        </w:rPr>
+        <w:t xml:space="preserve">- расстояние от оси стержня в сжатой зоне до сжатой грани. Значение требуется для вычисления высоты отгиба (проекции на плоскость, перпендикулярную продольной оси элемента) и горизонтального </w:t>
+      </w:r>
+      <w:proofErr w:type="spellStart"/>
+      <w:r>
+        <w:rPr>
+          <w:lang w:eastAsia="ru-RU"/>
+        </w:rPr>
+        <w:t>проложения</w:t>
+      </w:r>
+      <w:proofErr w:type="spellEnd"/>
+      <w:r>
+        <w:rPr>
+          <w:lang w:eastAsia="ru-RU"/>
+        </w:rPr>
+        <w:t xml:space="preserve"> отгиба (проекции на продольную ось элемента)</w:t>
+      </w:r>
+      <w:bookmarkStart w:id="144" w:name="_GoBack"/>
+      <w:bookmarkEnd w:id="144"/>
+    </w:p>
+    <w:p>
+      <w:pPr>
+        <w:rPr>
+          <w:lang w:eastAsia="ru-RU"/>
+        </w:rPr>
+      </w:pPr>
+      <w:r>
+        <w:rPr>
+          <w:lang w:eastAsia="ru-RU"/>
+        </w:rPr>
+        <w:lastRenderedPageBreak/>
+        <w:t>- длина зоны включения отгиба в работу, по умолчанию 50мм от точек перегиба стержня, минимальное значение 10мм. Данное значение необходимо для обеспечения математической определенности несущей способности отгиба в точке перегиба, а также косвенно учитывает наличие радиуса изгиба, т.е. некоторой переходной зоны несущей способности отгиба.</w:t>
+      </w:r>
+    </w:p>
+    <w:p>
+      <w:pPr>
         <w:pStyle w:val="2"/>
       </w:pPr>
-      <w:bookmarkStart w:id="144" w:name="_Toc203333378"/>
+      <w:bookmarkStart w:id="145" w:name="_Toc203333378"/>
       <w:r>
         <w:t>Описание порядка выполняемого расчета</w:t>
       </w:r>
-      <w:bookmarkEnd w:id="144"/>
+      <w:bookmarkEnd w:id="145"/>
     </w:p>
     <w:p>
       <w:r>
@@ -32684,7 +33133,16 @@
         </w:numPr>
       </w:pPr>
       <w:r>
-        <w:t>Назначение расчетных точек по длине элемента. В настоящий момент принято, что точки расположены равномерно по длине рассматриваемого участка от 0 до 3</w:t>
+        <w:t>Назначение расчетных точек по длине элемента. В настоящий момент</w:t>
+      </w:r>
+      <w:r>
+        <w:t xml:space="preserve"> по умолчанию</w:t>
+      </w:r>
+      <w:r>
+        <w:t xml:space="preserve"> принято, что точки расположены равномерно по длине рассматриваемого участка от 0 до 3</w:t>
+      </w:r>
+      <w:r>
+        <w:t>,3</w:t>
       </w:r>
       <w:r>
         <w:rPr>
@@ -32696,7 +33154,16 @@
         <w:t>0</w:t>
       </w:r>
       <w:r>
-        <w:t>, шаг точек принят 1/50 от длины рассматриваемого участка.</w:t>
+        <w:t>, шаг точек принят 1/5</w:t>
+      </w:r>
+      <w:r>
+        <w:t>5</w:t>
+      </w:r>
+      <w:r>
+        <w:t xml:space="preserve"> от длины рассматриваемого участка.</w:t>
+      </w:r>
+      <w:r>
+        <w:t xml:space="preserve"> Вы можете самостоятельно изменить длину рассматриваемого участка и количество расчетных точек в свойствах калькулятора.</w:t>
       </w:r>
     </w:p>
     <w:p>
@@ -32801,12 +33268,7 @@
         <w:t xml:space="preserve"> поперечной</w:t>
       </w:r>
       <w:r>
-        <w:t xml:space="preserve"> арматуре,</w:t>
-      </w:r>
-      <w:bookmarkStart w:id="145" w:name="_GoBack"/>
-      <w:bookmarkEnd w:id="145"/>
-      <w:r>
-        <w:t xml:space="preserve"> для рассматриваемого наклонного сечения находится новое значение длины проекции опасной наклонной трещины, при котором значения несущей способности по бетону и арматуре будут равны.</w:t>
+        <w:t xml:space="preserve"> арматуре, для рассматриваемого наклонного сечения находится новое значение длины проекции опасной наклонной трещины, при котором значения несущей способности по бетону и арматуре будут равны.</w:t>
       </w:r>
     </w:p>
     <w:p>
@@ -32994,8 +33456,8 @@
         <w:lastRenderedPageBreak/>
         <w:t>Список иллюстраций</w:t>
       </w:r>
-      <w:bookmarkEnd w:id="118"/>
       <w:bookmarkEnd w:id="119"/>
+      <w:bookmarkEnd w:id="120"/>
       <w:bookmarkEnd w:id="147"/>
     </w:p>
     <w:p>
@@ -42305,6 +42767,7 @@
     <w:lsdException w:name="HTML Sample" w:semiHidden="1" w:unhideWhenUsed="1"/>
     <w:lsdException w:name="HTML Typewriter" w:semiHidden="1" w:unhideWhenUsed="1"/>
     <w:lsdException w:name="HTML Variable" w:semiHidden="1" w:unhideWhenUsed="1"/>
+    <w:lsdException w:name="Normal Table" w:semiHidden="1" w:unhideWhenUsed="1"/>
     <w:lsdException w:name="annotation subject" w:semiHidden="1" w:unhideWhenUsed="1"/>
     <w:lsdException w:name="No List" w:semiHidden="1" w:unhideWhenUsed="1"/>
     <w:lsdException w:name="Outline List 1" w:semiHidden="1" w:unhideWhenUsed="1"/>
@@ -42348,8 +42811,10 @@
     <w:lsdException w:name="Table Elegant" w:semiHidden="1" w:unhideWhenUsed="1"/>
     <w:lsdException w:name="Table Professional" w:semiHidden="1" w:unhideWhenUsed="1"/>
     <w:lsdException w:name="Table Subtle 1" w:semiHidden="1" w:unhideWhenUsed="1"/>
+    <w:lsdException w:name="Table Subtle 2" w:semiHidden="1" w:unhideWhenUsed="1"/>
     <w:lsdException w:name="Table Web 1" w:semiHidden="1" w:unhideWhenUsed="1"/>
     <w:lsdException w:name="Table Web 2" w:semiHidden="1" w:unhideWhenUsed="1"/>
+    <w:lsdException w:name="Table Web 3" w:semiHidden="1" w:unhideWhenUsed="1"/>
     <w:lsdException w:name="Balloon Text" w:semiHidden="1" w:unhideWhenUsed="1"/>
     <w:lsdException w:name="Table Grid" w:uiPriority="59"/>
     <w:lsdException w:name="Table Theme" w:semiHidden="1" w:unhideWhenUsed="1"/>
@@ -43601,7 +44066,7 @@
 </file>
 
 <file path=customXml/itemProps1.xml><?xml version="1.0" encoding="utf-8"?>
-<ds:datastoreItem xmlns:ds="http://schemas.openxmlformats.org/officeDocument/2006/customXml" ds:itemID="{915408F5-75F2-4567-8436-6FAB8211CD44}">
+<ds:datastoreItem xmlns:ds="http://schemas.openxmlformats.org/officeDocument/2006/customXml" ds:itemID="{AFB8F865-192A-400C-9187-A4FE2EE98D56}">
   <ds:schemaRefs>
     <ds:schemaRef ds:uri="http://schemas.openxmlformats.org/officeDocument/2006/bibliography"/>
   </ds:schemaRefs>

</xml_diff>

<commit_message>
Change inclined section viewer
</commit_message>
<xml_diff>
--- a/StructureHelper/Documentation/Manuals/Руководство пользователя.docx
+++ b/StructureHelper/Documentation/Manuals/Руководство пользователя.docx
@@ -77,7 +77,7 @@
         <w:rPr>
           <w:rStyle w:val="af3"/>
         </w:rPr>
-        <w:t>7</w:t>
+        <w:t>8</w:t>
       </w:r>
       <w:r>
         <w:rPr>
@@ -110,6 +110,7 @@
           <w:docPartUnique/>
         </w:docPartObj>
       </w:sdtPr>
+      <w:sdtEndPr/>
       <w:sdtContent>
         <w:p>
           <w:pPr>
@@ -5063,7 +5064,21 @@
                 <w:rStyle w:val="a5"/>
                 <w:noProof/>
               </w:rPr>
-              <w:t>Поперечное армирование</w:t>
+              <w:t>Поперечное арми</w:t>
+            </w:r>
+            <w:r>
+              <w:rPr>
+                <w:rStyle w:val="a5"/>
+                <w:noProof/>
+              </w:rPr>
+              <w:t>р</w:t>
+            </w:r>
+            <w:r>
+              <w:rPr>
+                <w:rStyle w:val="a5"/>
+                <w:noProof/>
+              </w:rPr>
+              <w:t>ование</w:t>
             </w:r>
             <w:r>
               <w:rPr>
@@ -11792,21 +11807,7 @@
         <w:rPr>
           <w:rFonts w:eastAsiaTheme="minorEastAsia"/>
         </w:rPr>
-        <w:t xml:space="preserve"> – начальное относительное удлинение бетона, вызванное его предварительным напряжением, например, от дейс</w:t>
-      </w:r>
-      <w:proofErr w:type="spellStart"/>
-      <w:r>
-        <w:rPr>
-          <w:rFonts w:eastAsiaTheme="minorEastAsia"/>
-        </w:rPr>
-        <w:t>твия</w:t>
-      </w:r>
-      <w:proofErr w:type="spellEnd"/>
-      <w:r>
-        <w:rPr>
-          <w:rFonts w:eastAsiaTheme="minorEastAsia"/>
-        </w:rPr>
-        <w:t xml:space="preserve"> усадки или при более поздней укладке бетона в момент, когда сечение уже имеет некоторое напряженное состояние.</w:t>
+        <w:t xml:space="preserve"> – начальное относительное удлинение бетона, вызванное его предварительным напряжением, например, от действия усадки или при более поздней укладке бетона в момент, когда сечение уже имеет некоторое напряженное состояние.</w:t>
       </w:r>
       <w:r>
         <w:rPr>
@@ -12356,21 +12357,7 @@
         <w:rPr>
           <w:rFonts w:eastAsiaTheme="minorEastAsia"/>
         </w:rPr>
-        <w:t xml:space="preserve"> участвует вел</w:t>
-      </w:r>
-      <w:proofErr w:type="spellStart"/>
-      <w:r>
-        <w:rPr>
-          <w:rFonts w:eastAsiaTheme="minorEastAsia"/>
-        </w:rPr>
-        <w:t>ичина</w:t>
-      </w:r>
-      <w:proofErr w:type="spellEnd"/>
-      <w:r>
-        <w:rPr>
-          <w:rFonts w:eastAsiaTheme="minorEastAsia"/>
-        </w:rPr>
-        <w:t xml:space="preserve"> предварительного напряжения, то значение коэффициента </w:t>
+        <w:t xml:space="preserve"> участвует величина предварительного напряжения, то значение коэффициента </w:t>
       </w:r>
       <m:oMath>
         <m:sSub>
@@ -12406,19 +12393,11 @@
         </w:rPr>
         <w:t xml:space="preserve"> для данных ар</w:t>
       </w:r>
-      <w:proofErr w:type="spellStart"/>
       <w:r>
         <w:rPr>
           <w:rFonts w:eastAsiaTheme="minorEastAsia"/>
         </w:rPr>
-        <w:t>матурных</w:t>
-      </w:r>
-      <w:proofErr w:type="spellEnd"/>
-      <w:r>
-        <w:rPr>
-          <w:rFonts w:eastAsiaTheme="minorEastAsia"/>
-        </w:rPr>
-        <w:t xml:space="preserve"> стержней будет разным.</w:t>
+        <w:t>матурных стержней будет разным.</w:t>
       </w:r>
     </w:p>
     <w:p>
@@ -13255,19 +13234,11 @@
         </w:rPr>
         <w:t xml:space="preserve"> для железобетонной балки, имеющей 3 стержня в растянутой (нижней) зоне, при этом для стержня в середине балки задано предваритель</w:t>
       </w:r>
-      <w:proofErr w:type="spellStart"/>
       <w:r>
         <w:rPr>
           <w:rFonts w:eastAsiaTheme="minorEastAsia"/>
         </w:rPr>
-        <w:t>ная</w:t>
-      </w:r>
-      <w:proofErr w:type="spellEnd"/>
-      <w:r>
-        <w:rPr>
-          <w:rFonts w:eastAsiaTheme="minorEastAsia"/>
-        </w:rPr>
-        <w:t xml:space="preserve"> деформация равная 0.001, для остальных стержней предварительное напряжение не предусмотрено.</w:t>
+        <w:t>ная деформация равная 0.001, для остальных стержней предварительное напряжение не предусмотрено.</w:t>
       </w:r>
     </w:p>
     <w:p>
@@ -15299,15 +15270,7 @@
         </m:sSub>
       </m:oMath>
       <w:r>
-        <w:t xml:space="preserve"> - ши</w:t>
-      </w:r>
-      <w:proofErr w:type="spellStart"/>
-      <w:r>
-        <w:t>рина</w:t>
-      </w:r>
-      <w:proofErr w:type="spellEnd"/>
-      <w:r>
-        <w:t xml:space="preserve"> раскрытия трещин от непродолжительного действия </w:t>
+        <w:t xml:space="preserve"> - ширина раскрытия трещин от непродолжительного действия </w:t>
       </w:r>
       <w:r>
         <w:t>постоянных и</w:t>
@@ -32669,7 +32632,13 @@
     </w:p>
     <w:p>
       <w:r>
-        <w:t>Группа элементов поперечного армирования предназначена для агрегации других элементов и может включать в себя перечень других элементов (в том чисел других групп). При определении усилия, воспринимаемого группой, вычисляется сумма несущей способности всех элементов для заданного поперечного сечения.</w:t>
+        <w:t xml:space="preserve">Группа элементов поперечного армирования предназначена для агрегации других элементов и может включать в себя </w:t>
+      </w:r>
+      <w:r>
+        <w:t>набор</w:t>
+      </w:r>
+      <w:r>
+        <w:t xml:space="preserve"> других элементов (в том чисел других групп). При определении усилия, воспринимаемого группой, вычисляется сумма несущей способности всех элементов для заданного поперечного сечения.</w:t>
       </w:r>
     </w:p>
     <w:p>
@@ -33049,24 +33018,16 @@
         <w:rPr>
           <w:lang w:eastAsia="ru-RU"/>
         </w:rPr>
-        <w:t xml:space="preserve">- расстояние от оси стержня в сжатой зоне до сжатой грани. Значение требуется для вычисления высоты отгиба (проекции на плоскость, перпендикулярную продольной оси элемента) и горизонтального </w:t>
-      </w:r>
-      <w:proofErr w:type="spellStart"/>
-      <w:r>
-        <w:rPr>
-          <w:lang w:eastAsia="ru-RU"/>
-        </w:rPr>
-        <w:t>проложения</w:t>
-      </w:r>
-      <w:proofErr w:type="spellEnd"/>
-      <w:r>
-        <w:rPr>
-          <w:lang w:eastAsia="ru-RU"/>
-        </w:rPr>
-        <w:t xml:space="preserve"> отгиба (проекции на продольную ось элемента)</w:t>
+        <w:t>- расстояние от оси стержня в сжатой зоне до сжатой грани. Значение требуется для вычисления высоты отгиба (проекции на плоскость, перпендикулярную продольной оси элемента) и горизонтального проложения</w:t>
       </w:r>
       <w:bookmarkStart w:id="144" w:name="_GoBack"/>
       <w:bookmarkEnd w:id="144"/>
+      <w:r>
+        <w:rPr>
+          <w:lang w:eastAsia="ru-RU"/>
+        </w:rPr>
+        <w:t xml:space="preserve"> отгиба (проекции на продольную ось элемента)</w:t>
+      </w:r>
     </w:p>
     <w:p>
       <w:pPr>
@@ -40543,6 +40504,7 @@
         <w:docPartUnique/>
       </w:docPartObj>
     </w:sdtPr>
+    <w:sdtEndPr/>
     <w:sdtContent>
       <w:p>
         <w:pPr>
@@ -44066,7 +44028,7 @@
 </file>
 
 <file path=customXml/itemProps1.xml><?xml version="1.0" encoding="utf-8"?>
-<ds:datastoreItem xmlns:ds="http://schemas.openxmlformats.org/officeDocument/2006/customXml" ds:itemID="{AFB8F865-192A-400C-9187-A4FE2EE98D56}">
+<ds:datastoreItem xmlns:ds="http://schemas.openxmlformats.org/officeDocument/2006/customXml" ds:itemID="{661CEBE6-8735-40EE-9B8B-C10330644055}">
   <ds:schemaRefs>
     <ds:schemaRef ds:uri="http://schemas.openxmlformats.org/officeDocument/2006/bibliography"/>
   </ds:schemaRefs>

</xml_diff>